<commit_message>
ПР4: add CASE subsection — toolchain figure and SQL DDL forward engineering
Co-Authored-By: Claude Opus 5.5 <noreply@anthropic.com>
</commit_message>
<xml_diff>
--- a/tspp_work/pract4/ПР4_Кравченко_ІР-31.docx
+++ b/tspp_work/pract4/ПР4_Кравченко_ІР-31.docx
@@ -1260,7 +1260,7 @@
             <w:sz w:val="28"/>
             <w:szCs w:val="28"/>
           </w:rPr>
-          <w:t xml:space="preserve">13</w:t>
+          <w:t xml:space="preserve">14</w:t>
         </w:r>
         <w:r>
           <w:rPr>
@@ -1331,7 +1331,7 @@
             <w:sz w:val="28"/>
             <w:szCs w:val="28"/>
           </w:rPr>
-          <w:t xml:space="preserve">18</w:t>
+          <w:t xml:space="preserve">22</w:t>
         </w:r>
         <w:r>
           <w:rPr>
@@ -1402,7 +1402,7 @@
             <w:sz w:val="28"/>
             <w:szCs w:val="28"/>
           </w:rPr>
-          <w:t xml:space="preserve">24</w:t>
+          <w:t xml:space="preserve">30</w:t>
         </w:r>
         <w:r>
           <w:rPr>
@@ -1416,14 +1416,14 @@
     </w:p>
     <w:p>
       <w:pPr>
-        <w:pStyle w:val="874"/>
+        <w:pStyle w:val="875"/>
         <w:keepNext w:val="0"/>
         <w:widowControl/>
         <w:tabs>
           <w:tab w:pos="9354" w:val="right" w:leader="dot"/>
         </w:tabs>
         <w:spacing w:line="360" w:lineRule="auto" w:before="0" w:after="0"/>
-        <w:ind w:firstLine="0" w:left="0"/>
+        <w:ind w:firstLine="0" w:left="425"/>
         <w:jc w:val="left"/>
       </w:pPr>
       <w:hyperlink w:anchor="_Toc000008" w:history="1">
@@ -1433,7 +1433,7 @@
             <w:sz w:val="28"/>
             <w:szCs w:val="28"/>
           </w:rPr>
-          <w:t xml:space="preserve">ВИСНОВКИ</w:t>
+          <w:t xml:space="preserve">2.6. Реалізація моделей у CASE-засобах</w:t>
         </w:r>
         <w:r>
           <w:rPr>
@@ -1473,7 +1473,7 @@
             <w:sz w:val="28"/>
             <w:szCs w:val="28"/>
           </w:rPr>
-          <w:t xml:space="preserve">29</w:t>
+          <w:t xml:space="preserve">36</w:t>
         </w:r>
         <w:r>
           <w:rPr>
@@ -1504,7 +1504,7 @@
             <w:sz w:val="28"/>
             <w:szCs w:val="28"/>
           </w:rPr>
-          <w:t xml:space="preserve">СПИСОК ВИКОРИСТАНИХ ДЖЕРЕЛ</w:t>
+          <w:t xml:space="preserve">ВИСНОВКИ</w:t>
         </w:r>
         <w:r>
           <w:rPr>
@@ -1544,7 +1544,78 @@
             <w:sz w:val="28"/>
             <w:szCs w:val="28"/>
           </w:rPr>
-          <w:t xml:space="preserve">30</w:t>
+          <w:t xml:space="preserve">41</w:t>
+        </w:r>
+        <w:r>
+          <w:rPr>
+            <w:rFonts w:ascii="Times New Roman" w:hAnsi="Times New Roman" w:cs="Times New Roman"/>
+            <w:sz w:val="28"/>
+            <w:szCs w:val="28"/>
+          </w:rPr>
+          <w:fldChar w:fldCharType="end"/>
+        </w:r>
+      </w:hyperlink>
+    </w:p>
+    <w:p>
+      <w:pPr>
+        <w:pStyle w:val="874"/>
+        <w:keepNext w:val="0"/>
+        <w:widowControl/>
+        <w:tabs>
+          <w:tab w:pos="9354" w:val="right" w:leader="dot"/>
+        </w:tabs>
+        <w:spacing w:line="360" w:lineRule="auto" w:before="0" w:after="0"/>
+        <w:ind w:firstLine="0" w:left="0"/>
+        <w:jc w:val="left"/>
+      </w:pPr>
+      <w:hyperlink w:anchor="_Toc000010" w:history="1">
+        <w:r>
+          <w:rPr>
+            <w:rFonts w:ascii="Times New Roman" w:hAnsi="Times New Roman" w:cs="Times New Roman"/>
+            <w:sz w:val="28"/>
+            <w:szCs w:val="28"/>
+          </w:rPr>
+          <w:t xml:space="preserve">СПИСОК ВИКОРИСТАНИХ ДЖЕРЕЛ</w:t>
+        </w:r>
+        <w:r>
+          <w:rPr>
+            <w:rFonts w:ascii="Times New Roman" w:hAnsi="Times New Roman" w:cs="Times New Roman"/>
+            <w:sz w:val="28"/>
+            <w:szCs w:val="28"/>
+          </w:rPr>
+          <w:tab/>
+        </w:r>
+        <w:r>
+          <w:rPr>
+            <w:rFonts w:ascii="Times New Roman" w:hAnsi="Times New Roman" w:cs="Times New Roman"/>
+            <w:sz w:val="28"/>
+            <w:szCs w:val="28"/>
+          </w:rPr>
+          <w:fldChar w:fldCharType="begin"/>
+        </w:r>
+        <w:r>
+          <w:rPr>
+            <w:rFonts w:ascii="Times New Roman" w:hAnsi="Times New Roman" w:cs="Times New Roman"/>
+            <w:sz w:val="28"/>
+            <w:szCs w:val="28"/>
+          </w:rPr>
+          <w:instrText xml:space="preserve"> PAGEREF _Toc000010 \h </w:instrText>
+        </w:r>
+        <w:r>
+          <w:rPr>
+            <w:rFonts w:ascii="Times New Roman" w:hAnsi="Times New Roman" w:cs="Times New Roman"/>
+            <w:sz w:val="28"/>
+            <w:szCs w:val="28"/>
+          </w:rPr>
+          <w:fldChar w:fldCharType="separate"/>
+        </w:r>
+        <w:r>
+          <w:rPr>
+            <w:rFonts w:ascii="Times New Roman" w:hAnsi="Times New Roman" w:cs="Times New Roman"/>
+            <w:sz w:val="28"/>
+            <w:szCs w:val="28"/>
+          </w:rPr>
+          <w:t xml:space="preserve">42</w:t>
         </w:r>
         <w:r>
           <w:rPr>
@@ -2279,7 +2350,7 @@
           </w:tcPr>
           <w:p>
             <w:pPr>
-              <w:keepNext w:val="0"/>
+              <w:keepNext/>
               <w:widowControl/>
               <w:spacing w:line="240" w:lineRule="auto" w:before="0" w:after="0"/>
               <w:ind w:firstLine="0" w:left="0"/>
@@ -2304,7 +2375,7 @@
           </w:tcPr>
           <w:p>
             <w:pPr>
-              <w:keepNext w:val="0"/>
+              <w:keepNext/>
               <w:widowControl/>
               <w:spacing w:line="240" w:lineRule="auto" w:before="0" w:after="0"/>
               <w:ind w:firstLine="0" w:left="0"/>
@@ -2329,7 +2400,7 @@
           </w:tcPr>
           <w:p>
             <w:pPr>
-              <w:keepNext w:val="0"/>
+              <w:keepNext/>
               <w:widowControl/>
               <w:spacing w:line="240" w:lineRule="auto" w:before="0" w:after="0"/>
               <w:ind w:firstLine="0" w:left="0"/>
@@ -2354,6 +2425,36 @@
           </w:tcPr>
           <w:p>
             <w:pPr>
+              <w:keepNext/>
+              <w:widowControl/>
+              <w:spacing w:line="240" w:lineRule="auto" w:before="0" w:after="0"/>
+              <w:ind w:firstLine="0" w:left="0"/>
+              <w:jc w:val="left"/>
+            </w:pPr>
+            <w:r/>
+            <w:r>
+              <w:rPr>
+                <w:rFonts w:ascii="Times New Roman" w:hAnsi="Times New Roman" w:cs="Times New Roman" w:eastAsia="Times New Roman"/>
+                <w:b w:val="0"/>
+                <w:i w:val="0"/>
+                <w:color w:val="000000"/>
+                <w:sz w:val="24"/>
+              </w:rPr>
+              <w:t>4.11–4.13</w:t>
+            </w:r>
+          </w:p>
+        </w:tc>
+      </w:tr>
+      <w:tr>
+        <w:trPr>
+          <w:cantSplit w:val="true"/>
+        </w:trPr>
+        <w:tc>
+          <w:tcPr>
+            <w:tcW w:type="dxa" w:w="1754"/>
+          </w:tcPr>
+          <w:p>
+            <w:pPr>
               <w:keepNext w:val="0"/>
               <w:widowControl/>
               <w:spacing w:line="240" w:lineRule="auto" w:before="0" w:after="0"/>
@@ -2369,7 +2470,82 @@
                 <w:color w:val="000000"/>
                 <w:sz w:val="24"/>
               </w:rPr>
-              <w:t>4.11–4.13</w:t>
+              <w:t>Реалізація моделей</w:t>
+            </w:r>
+          </w:p>
+        </w:tc>
+        <w:tc>
+          <w:tcPr>
+            <w:tcW w:type="dxa" w:w="2572"/>
+          </w:tcPr>
+          <w:p>
+            <w:pPr>
+              <w:keepNext w:val="0"/>
+              <w:widowControl/>
+              <w:spacing w:line="240" w:lineRule="auto" w:before="0" w:after="0"/>
+              <w:ind w:firstLine="0" w:left="0"/>
+              <w:jc w:val="left"/>
+            </w:pPr>
+            <w:r/>
+            <w:r>
+              <w:rPr>
+                <w:rFonts w:ascii="Times New Roman" w:hAnsi="Times New Roman" w:cs="Times New Roman" w:eastAsia="Times New Roman"/>
+                <w:b w:val="0"/>
+                <w:i w:val="0"/>
+                <w:color w:val="000000"/>
+                <w:sz w:val="24"/>
+              </w:rPr>
+              <w:t>CASE-засоби, генерація SQL DDL</w:t>
+            </w:r>
+          </w:p>
+        </w:tc>
+        <w:tc>
+          <w:tcPr>
+            <w:tcW w:type="dxa" w:w="3508"/>
+          </w:tcPr>
+          <w:p>
+            <w:pPr>
+              <w:keepNext w:val="0"/>
+              <w:widowControl/>
+              <w:spacing w:line="240" w:lineRule="auto" w:before="0" w:after="0"/>
+              <w:ind w:firstLine="0" w:left="0"/>
+              <w:jc w:val="left"/>
+            </w:pPr>
+            <w:r/>
+            <w:r>
+              <w:rPr>
+                <w:rFonts w:ascii="Times New Roman" w:hAnsi="Times New Roman" w:cs="Times New Roman" w:eastAsia="Times New Roman"/>
+                <w:b w:val="0"/>
+                <w:i w:val="0"/>
+                <w:color w:val="000000"/>
+                <w:sz w:val="24"/>
+              </w:rPr>
+              <w:t>Засоби побудови моделей, обробку моделей і генерацію схеми БД</w:t>
+            </w:r>
+          </w:p>
+        </w:tc>
+        <w:tc>
+          <w:tcPr>
+            <w:tcW w:type="dxa" w:w="1520"/>
+          </w:tcPr>
+          <w:p>
+            <w:pPr>
+              <w:keepNext w:val="0"/>
+              <w:widowControl/>
+              <w:spacing w:line="240" w:lineRule="auto" w:before="0" w:after="0"/>
+              <w:ind w:firstLine="0" w:left="0"/>
+              <w:jc w:val="left"/>
+            </w:pPr>
+            <w:r/>
+            <w:r>
+              <w:rPr>
+                <w:rFonts w:ascii="Times New Roman" w:hAnsi="Times New Roman" w:cs="Times New Roman" w:eastAsia="Times New Roman"/>
+                <w:b w:val="0"/>
+                <w:i w:val="0"/>
+                <w:color w:val="000000"/>
+                <w:sz w:val="24"/>
+              </w:rPr>
+              <w:t>4.14, 4.15</w:t>
             </w:r>
           </w:p>
         </w:tc>
@@ -2896,6 +3072,44 @@
     </w:p>
     <w:p>
       <w:pPr>
+        <w:keepNext w:val="0"/>
+        <w:widowControl/>
+        <w:spacing w:line="360" w:lineRule="auto" w:before="0" w:after="0"/>
+        <w:ind w:firstLine="709" w:left="0"/>
+        <w:jc w:val="both"/>
+      </w:pPr>
+      <w:r>
+        <w:rPr>
+          <w:rFonts w:ascii="Times New Roman" w:hAnsi="Times New Roman" w:cs="Times New Roman" w:eastAsia="Times New Roman"/>
+          <w:b w:val="0"/>
+          <w:i w:val="0"/>
+          <w:color w:val="000000"/>
+          <w:sz w:val="28"/>
+        </w:rPr>
+        <w:t>Розподіл межових стрілок за сторонами блоку визначає межі відповідальності системи. Стрілки входу відображають те, що система перетворює: потік повідомлень від сенсорів і перехоплювачів надходить без участі людини, тоді як рішення персоналу КП вводяться через автоматизовані робочі місця (АРМ). Стрілки управління не змінюються під час виконання функції, а лише обмежують її: правила застосування задають умови, за яких ціль може бути призначена на перехоплення, плани польотів дружньої авіації — простір, у якому призначення заборонене, вимоги захисту інформації — порядок автентифікації джерел і доступу користувачів. Стрілки виходу описують результати, що споживаються поза межами системи: повітряну обстановку переглядає персонал КП, бойові завдання отримують розрахунки перехоплювачів, звіти й сповіщення надходять до командування, техніків і логістів.</w:t>
+      </w:r>
+    </w:p>
+    <w:p>
+      <w:pPr>
+        <w:keepNext w:val="0"/>
+        <w:widowControl/>
+        <w:spacing w:line="360" w:lineRule="auto" w:before="0" w:after="0"/>
+        <w:ind w:firstLine="709" w:left="0"/>
+        <w:jc w:val="both"/>
+      </w:pPr>
+      <w:r>
+        <w:rPr>
+          <w:rFonts w:ascii="Times New Roman" w:hAnsi="Times New Roman" w:cs="Times New Roman" w:eastAsia="Times New Roman"/>
+          <w:b w:val="0"/>
+          <w:i w:val="0"/>
+          <w:color w:val="000000"/>
+          <w:sz w:val="28"/>
+        </w:rPr>
+        <w:t>Рамка діаграми містить службові поля, прийняті в нотації IDEF0: у верхній частині — автора, назву проекту, дату, стан розроблення («робочий») і читача, тобто особу, що рецензує модель; у нижній частині — вузол A-0, назву діаграми та її порядковий номер. Нумерація вузла A-0 свідчить, що діаграма є контекстною, тобто розташованою над діаграмою верхнього рівня A0.</w:t>
+      </w:r>
+    </w:p>
+    <w:p>
+      <w:pPr>
         <w:pStyle w:val="829"/>
         <w:keepNext/>
         <w:pageBreakBefore w:val="0"/>
@@ -3272,7 +3486,7 @@
           <w:color w:val="000000"/>
           <w:sz w:val="28"/>
         </w:rPr>
-        <w:t>Діаграма прецедентів (рис. 4.5) побудована в практичній роботі № 1 [4] і є вихідною концептуальною моделлю системи. Акторами є ролі командного пункту (узагальнені абстрактним актором «Персонал КП»), командир розрахунку, оператор перехоплювача, а також системи-актори «Сенсорний вузол» і «НСУ розрахунку». Прецедент «UC-04 Призначити розрахунок» завжди включає «UC-05 Перевірити деконфлікцію» («include»), а прецедент «UC-06 Обрати резервний розрахунок» розширює його («extend»). Специфікації основних прецедентів (короткий опис, основний і альтернативні потоки, передумови та постумови) наведено в ПР1.</w:t>
+        <w:t>Діаграма прецедентів (варіантів використання) визначає функціональне призначення системи: що система повинна робити, не розкриваючи, як саме вона це робить [2]. Діаграма (рис. 4.5) побудована в практичній роботі № 1 [4] і є вихідною концептуальною моделлю системи. Прямокутник позначає межу системи «IoT-платформа «Щит-Лінк»: збір даних і бойове управління»; актори розташовані поза нею, прецеденти — всередині. Лінія асоціації між актором і прецедентом означає, що актор ініціює прецедент або бере участь у ньому.</w:t>
       </w:r>
     </w:p>
     <w:p>
@@ -3361,6 +3575,375 @@
     </w:p>
     <w:p>
       <w:pPr>
+        <w:keepNext w:val="0"/>
+        <w:widowControl/>
+        <w:spacing w:line="360" w:lineRule="auto" w:before="0" w:after="0"/>
+        <w:ind w:firstLine="709" w:left="0"/>
+        <w:jc w:val="both"/>
+      </w:pPr>
+      <w:r>
+        <w:rPr>
+          <w:rFonts w:ascii="Times New Roman" w:hAnsi="Times New Roman" w:cs="Times New Roman" w:eastAsia="Times New Roman"/>
+          <w:b w:val="0"/>
+          <w:i w:val="0"/>
+          <w:color w:val="000000"/>
+          <w:sz w:val="28"/>
+        </w:rPr>
+        <w:t>На діаграмі визначено шість акторів-людей і двох акторів-систем:</w:t>
+      </w:r>
+    </w:p>
+    <w:p>
+      <w:pPr>
+        <w:keepNext w:val="0"/>
+        <w:widowControl/>
+        <w:spacing w:line="360" w:lineRule="auto" w:before="0" w:after="0"/>
+        <w:ind w:firstLine="709" w:left="0"/>
+        <w:jc w:val="both"/>
+      </w:pPr>
+      <w:r>
+        <w:rPr>
+          <w:rFonts w:ascii="Times New Roman" w:hAnsi="Times New Roman" w:cs="Times New Roman" w:eastAsia="Times New Roman"/>
+          <w:b w:val="0"/>
+          <w:i w:val="0"/>
+          <w:color w:val="000000"/>
+          <w:sz w:val="28"/>
+        </w:rPr>
+        <w:t xml:space="preserve">– </w:t>
+      </w:r>
+      <w:r>
+        <w:rPr>
+          <w:rFonts w:ascii="Times New Roman" w:hAnsi="Times New Roman" w:cs="Times New Roman" w:eastAsia="Times New Roman"/>
+          <w:b/>
+          <w:i w:val="0"/>
+          <w:color w:val="000000"/>
+          <w:sz w:val="28"/>
+        </w:rPr>
+        <w:t>Персонал КП</w:t>
+      </w:r>
+      <w:r>
+        <w:rPr>
+          <w:rFonts w:ascii="Times New Roman" w:hAnsi="Times New Roman" w:cs="Times New Roman" w:eastAsia="Times New Roman"/>
+          <w:b w:val="0"/>
+          <w:i w:val="0"/>
+          <w:color w:val="000000"/>
+          <w:sz w:val="28"/>
+        </w:rPr>
+        <w:t xml:space="preserve"> — абстрактний актор, що узагальнює ролі командного пункту; відношення узагальнення від аналітика обстановки, оперативного чергового та офіцера бойового управління означає, що кожна з цих ролей успадковує його прецедент «UC-02 Переглянути повітряну обстановку»;</w:t>
+      </w:r>
+    </w:p>
+    <w:p>
+      <w:pPr>
+        <w:keepNext w:val="0"/>
+        <w:widowControl/>
+        <w:spacing w:line="360" w:lineRule="auto" w:before="0" w:after="0"/>
+        <w:ind w:firstLine="709" w:left="0"/>
+        <w:jc w:val="both"/>
+      </w:pPr>
+      <w:r>
+        <w:rPr>
+          <w:rFonts w:ascii="Times New Roman" w:hAnsi="Times New Roman" w:cs="Times New Roman" w:eastAsia="Times New Roman"/>
+          <w:b w:val="0"/>
+          <w:i w:val="0"/>
+          <w:color w:val="000000"/>
+          <w:sz w:val="28"/>
+        </w:rPr>
+        <w:t xml:space="preserve">– </w:t>
+      </w:r>
+      <w:r>
+        <w:rPr>
+          <w:rFonts w:ascii="Times New Roman" w:hAnsi="Times New Roman" w:cs="Times New Roman" w:eastAsia="Times New Roman"/>
+          <w:b/>
+          <w:i w:val="0"/>
+          <w:color w:val="000000"/>
+          <w:sz w:val="28"/>
+        </w:rPr>
+        <w:t>Аналітик обстановки</w:t>
+      </w:r>
+      <w:r>
+        <w:rPr>
+          <w:rFonts w:ascii="Times New Roman" w:hAnsi="Times New Roman" w:cs="Times New Roman" w:eastAsia="Times New Roman"/>
+          <w:b w:val="0"/>
+          <w:i w:val="0"/>
+          <w:color w:val="000000"/>
+          <w:sz w:val="28"/>
+        </w:rPr>
+        <w:t xml:space="preserve"> веде повітряні треки та ініціює прецедент «UC-03 Класифікувати ціль»: підтверджує або змінює тип і належність цілі, запропоновані класифікатором;</w:t>
+      </w:r>
+    </w:p>
+    <w:p>
+      <w:pPr>
+        <w:keepNext w:val="0"/>
+        <w:widowControl/>
+        <w:spacing w:line="360" w:lineRule="auto" w:before="0" w:after="0"/>
+        <w:ind w:firstLine="709" w:left="0"/>
+        <w:jc w:val="both"/>
+      </w:pPr>
+      <w:r>
+        <w:rPr>
+          <w:rFonts w:ascii="Times New Roman" w:hAnsi="Times New Roman" w:cs="Times New Roman" w:eastAsia="Times New Roman"/>
+          <w:b w:val="0"/>
+          <w:i w:val="0"/>
+          <w:color w:val="000000"/>
+          <w:sz w:val="28"/>
+        </w:rPr>
+        <w:t xml:space="preserve">– </w:t>
+      </w:r>
+      <w:r>
+        <w:rPr>
+          <w:rFonts w:ascii="Times New Roman" w:hAnsi="Times New Roman" w:cs="Times New Roman" w:eastAsia="Times New Roman"/>
+          <w:b/>
+          <w:i w:val="0"/>
+          <w:color w:val="000000"/>
+          <w:sz w:val="28"/>
+        </w:rPr>
+        <w:t>Оперативний черговий</w:t>
+      </w:r>
+      <w:r>
+        <w:rPr>
+          <w:rFonts w:ascii="Times New Roman" w:hAnsi="Times New Roman" w:cs="Times New Roman" w:eastAsia="Times New Roman"/>
+          <w:b w:val="0"/>
+          <w:i w:val="0"/>
+          <w:color w:val="000000"/>
+          <w:sz w:val="28"/>
+        </w:rPr>
+        <w:t xml:space="preserve"> ініціює прецедент «UC-07 Санкціонувати пуск» — без цього прецедента жодне бойове завдання не може бути надіслане розрахунку;</w:t>
+      </w:r>
+    </w:p>
+    <w:p>
+      <w:pPr>
+        <w:keepNext w:val="0"/>
+        <w:widowControl/>
+        <w:spacing w:line="360" w:lineRule="auto" w:before="0" w:after="0"/>
+        <w:ind w:firstLine="709" w:left="0"/>
+        <w:jc w:val="both"/>
+      </w:pPr>
+      <w:r>
+        <w:rPr>
+          <w:rFonts w:ascii="Times New Roman" w:hAnsi="Times New Roman" w:cs="Times New Roman" w:eastAsia="Times New Roman"/>
+          <w:b w:val="0"/>
+          <w:i w:val="0"/>
+          <w:color w:val="000000"/>
+          <w:sz w:val="28"/>
+        </w:rPr>
+        <w:t xml:space="preserve">– </w:t>
+      </w:r>
+      <w:r>
+        <w:rPr>
+          <w:rFonts w:ascii="Times New Roman" w:hAnsi="Times New Roman" w:cs="Times New Roman" w:eastAsia="Times New Roman"/>
+          <w:b/>
+          <w:i w:val="0"/>
+          <w:color w:val="000000"/>
+          <w:sz w:val="28"/>
+        </w:rPr>
+        <w:t>Офіцер бойового управління</w:t>
+      </w:r>
+      <w:r>
+        <w:rPr>
+          <w:rFonts w:ascii="Times New Roman" w:hAnsi="Times New Roman" w:cs="Times New Roman" w:eastAsia="Times New Roman"/>
+          <w:b w:val="0"/>
+          <w:i w:val="0"/>
+          <w:color w:val="000000"/>
+          <w:sz w:val="28"/>
+        </w:rPr>
+        <w:t xml:space="preserve"> ініціює прецедент «UC-04 Призначити розрахунок», обираючи розрахунок для цілі з черги на перехоплення;</w:t>
+      </w:r>
+    </w:p>
+    <w:p>
+      <w:pPr>
+        <w:keepNext w:val="0"/>
+        <w:widowControl/>
+        <w:spacing w:line="360" w:lineRule="auto" w:before="0" w:after="0"/>
+        <w:ind w:firstLine="709" w:left="0"/>
+        <w:jc w:val="both"/>
+      </w:pPr>
+      <w:r>
+        <w:rPr>
+          <w:rFonts w:ascii="Times New Roman" w:hAnsi="Times New Roman" w:cs="Times New Roman" w:eastAsia="Times New Roman"/>
+          <w:b w:val="0"/>
+          <w:i w:val="0"/>
+          <w:color w:val="000000"/>
+          <w:sz w:val="28"/>
+        </w:rPr>
+        <w:t xml:space="preserve">– </w:t>
+      </w:r>
+      <w:r>
+        <w:rPr>
+          <w:rFonts w:ascii="Times New Roman" w:hAnsi="Times New Roman" w:cs="Times New Roman" w:eastAsia="Times New Roman"/>
+          <w:b/>
+          <w:i w:val="0"/>
+          <w:color w:val="000000"/>
+          <w:sz w:val="28"/>
+        </w:rPr>
+        <w:t>Командир розрахунку</w:t>
+      </w:r>
+      <w:r>
+        <w:rPr>
+          <w:rFonts w:ascii="Times New Roman" w:hAnsi="Times New Roman" w:cs="Times New Roman" w:eastAsia="Times New Roman"/>
+          <w:b w:val="0"/>
+          <w:i w:val="0"/>
+          <w:color w:val="000000"/>
+          <w:sz w:val="28"/>
+        </w:rPr>
+        <w:t xml:space="preserve"> бере участь у прецедентах «UC-08 Прийняти бойове завдання» та «UC-11 Доповісти про результат»;</w:t>
+      </w:r>
+    </w:p>
+    <w:p>
+      <w:pPr>
+        <w:keepNext w:val="0"/>
+        <w:widowControl/>
+        <w:spacing w:line="360" w:lineRule="auto" w:before="0" w:after="0"/>
+        <w:ind w:firstLine="709" w:left="0"/>
+        <w:jc w:val="both"/>
+      </w:pPr>
+      <w:r>
+        <w:rPr>
+          <w:rFonts w:ascii="Times New Roman" w:hAnsi="Times New Roman" w:cs="Times New Roman" w:eastAsia="Times New Roman"/>
+          <w:b w:val="0"/>
+          <w:i w:val="0"/>
+          <w:color w:val="000000"/>
+          <w:sz w:val="28"/>
+        </w:rPr>
+        <w:t xml:space="preserve">– </w:t>
+      </w:r>
+      <w:r>
+        <w:rPr>
+          <w:rFonts w:ascii="Times New Roman" w:hAnsi="Times New Roman" w:cs="Times New Roman" w:eastAsia="Times New Roman"/>
+          <w:b/>
+          <w:i w:val="0"/>
+          <w:color w:val="000000"/>
+          <w:sz w:val="28"/>
+        </w:rPr>
+        <w:t>Оператор перехоплювача</w:t>
+      </w:r>
+      <w:r>
+        <w:rPr>
+          <w:rFonts w:ascii="Times New Roman" w:hAnsi="Times New Roman" w:cs="Times New Roman" w:eastAsia="Times New Roman"/>
+          <w:b w:val="0"/>
+          <w:i w:val="0"/>
+          <w:color w:val="000000"/>
+          <w:sz w:val="28"/>
+        </w:rPr>
+        <w:t xml:space="preserve"> бере участь у прецеденті «UC-09 Супроводжувати місію» і підтверджує ціль на фазі наведення;</w:t>
+      </w:r>
+    </w:p>
+    <w:p>
+      <w:pPr>
+        <w:keepNext w:val="0"/>
+        <w:widowControl/>
+        <w:spacing w:line="360" w:lineRule="auto" w:before="0" w:after="0"/>
+        <w:ind w:firstLine="709" w:left="0"/>
+        <w:jc w:val="both"/>
+      </w:pPr>
+      <w:r>
+        <w:rPr>
+          <w:rFonts w:ascii="Times New Roman" w:hAnsi="Times New Roman" w:cs="Times New Roman" w:eastAsia="Times New Roman"/>
+          <w:b w:val="0"/>
+          <w:i w:val="0"/>
+          <w:color w:val="000000"/>
+          <w:sz w:val="28"/>
+        </w:rPr>
+        <w:t xml:space="preserve">– </w:t>
+      </w:r>
+      <w:r>
+        <w:rPr>
+          <w:rFonts w:ascii="Times New Roman" w:hAnsi="Times New Roman" w:cs="Times New Roman" w:eastAsia="Times New Roman"/>
+          <w:b/>
+          <w:i w:val="0"/>
+          <w:color w:val="000000"/>
+          <w:sz w:val="28"/>
+        </w:rPr>
+        <w:t>Сенсорний вузол</w:t>
+      </w:r>
+      <w:r>
+        <w:rPr>
+          <w:rFonts w:ascii="Times New Roman" w:hAnsi="Times New Roman" w:cs="Times New Roman" w:eastAsia="Times New Roman"/>
+          <w:b w:val="0"/>
+          <w:i w:val="0"/>
+          <w:color w:val="000000"/>
+          <w:sz w:val="28"/>
+        </w:rPr>
+        <w:t xml:space="preserve"> (актор-система) ініціює прецедент «UC-01 Передати виявлення» за протоколами MQTT або ASTERIX без участі людини;</w:t>
+      </w:r>
+    </w:p>
+    <w:p>
+      <w:pPr>
+        <w:keepNext w:val="0"/>
+        <w:widowControl/>
+        <w:spacing w:line="360" w:lineRule="auto" w:before="0" w:after="0"/>
+        <w:ind w:firstLine="709" w:left="0"/>
+        <w:jc w:val="both"/>
+      </w:pPr>
+      <w:r>
+        <w:rPr>
+          <w:rFonts w:ascii="Times New Roman" w:hAnsi="Times New Roman" w:cs="Times New Roman" w:eastAsia="Times New Roman"/>
+          <w:b w:val="0"/>
+          <w:i w:val="0"/>
+          <w:color w:val="000000"/>
+          <w:sz w:val="28"/>
+        </w:rPr>
+        <w:t xml:space="preserve">– </w:t>
+      </w:r>
+      <w:r>
+        <w:rPr>
+          <w:rFonts w:ascii="Times New Roman" w:hAnsi="Times New Roman" w:cs="Times New Roman" w:eastAsia="Times New Roman"/>
+          <w:b/>
+          <w:i w:val="0"/>
+          <w:color w:val="000000"/>
+          <w:sz w:val="28"/>
+        </w:rPr>
+        <w:t>НСУ розрахунку</w:t>
+      </w:r>
+      <w:r>
+        <w:rPr>
+          <w:rFonts w:ascii="Times New Roman" w:hAnsi="Times New Roman" w:cs="Times New Roman" w:eastAsia="Times New Roman"/>
+          <w:b w:val="0"/>
+          <w:i w:val="0"/>
+          <w:color w:val="000000"/>
+          <w:sz w:val="28"/>
+        </w:rPr>
+        <w:t xml:space="preserve"> (наземна станція управління, актор-система) передає телеметрію перехоплювача в межах прецедента «UC-09 Супроводжувати місію».</w:t>
+      </w:r>
+    </w:p>
+    <w:p>
+      <w:pPr>
+        <w:keepNext w:val="0"/>
+        <w:widowControl/>
+        <w:spacing w:line="360" w:lineRule="auto" w:before="0" w:after="0"/>
+        <w:ind w:firstLine="709" w:left="0"/>
+        <w:jc w:val="both"/>
+      </w:pPr>
+      <w:r>
+        <w:rPr>
+          <w:rFonts w:ascii="Times New Roman" w:hAnsi="Times New Roman" w:cs="Times New Roman" w:eastAsia="Times New Roman"/>
+          <w:b w:val="0"/>
+          <w:i w:val="0"/>
+          <w:color w:val="000000"/>
+          <w:sz w:val="28"/>
+        </w:rPr>
+        <w:t>Між прецедентами встановлено три залежності. Відношення включення («include») від «UC-04 Призначити розрахунок» до «UC-05 Перевірити деконфлікцію» означає, що перевірка відсутності конфлікту з дружньою авіацією та зонами заборони ураження виконується за кожного призначення без винятків. Відношення розширення («extend») від «UC-06 Обрати резервний розрахунок» до «UC-04» описує альтернативний потік: резервний розрахунок обирається лише тоді, коли основний не підтвердив завдання протягом 15 с. Друге відношення розширення — від «UC-10 Скасувати місію» до «UC-09 Супроводжувати місію» — застосовується за командою скасування під час виконання місії.</w:t>
+      </w:r>
+    </w:p>
+    <w:p>
+      <w:pPr>
+        <w:keepNext w:val="0"/>
+        <w:widowControl/>
+        <w:spacing w:line="360" w:lineRule="auto" w:before="0" w:after="0"/>
+        <w:ind w:firstLine="709" w:left="0"/>
+        <w:jc w:val="both"/>
+      </w:pPr>
+      <w:r>
+        <w:rPr>
+          <w:rFonts w:ascii="Times New Roman" w:hAnsi="Times New Roman" w:cs="Times New Roman" w:eastAsia="Times New Roman"/>
+          <w:b w:val="0"/>
+          <w:i w:val="0"/>
+          <w:color w:val="000000"/>
+          <w:sz w:val="28"/>
+        </w:rPr>
+        <w:t>Прецеденти діаграми утворюють наскрізний ланцюжок «виявлення — класифікація — призначення — санкціонування — прийняття завдання — супровід — доповідь», який далі деталізують діаграми станів, діяльності, послідовності та кооперації. Специфікації основних прецедентів (короткий опис, основний і альтернативні потоки, передумови та постумови) наведено в ПР1 [4]; прецеденти забезпечення (облік техніки й запасів, звітність, адміністрування) винесено на окрему діаграму ПР1 і в цьому розділі не деталізуються.</w:t>
+      </w:r>
+    </w:p>
+    <w:p>
+      <w:pPr>
         <w:pStyle w:val="829"/>
         <w:keepNext/>
         <w:pageBreakBefore w:val="0"/>
@@ -3463,6 +4046,25 @@
     </w:p>
     <w:p>
       <w:pPr>
+        <w:keepNext w:val="0"/>
+        <w:widowControl/>
+        <w:spacing w:line="360" w:lineRule="auto" w:before="0" w:after="0"/>
+        <w:ind w:firstLine="709" w:left="0"/>
+        <w:jc w:val="both"/>
+      </w:pPr>
+      <w:r>
+        <w:rPr>
+          <w:rFonts w:ascii="Times New Roman" w:hAnsi="Times New Roman" w:cs="Times New Roman" w:eastAsia="Times New Roman"/>
+          <w:b w:val="0"/>
+          <w:i w:val="0"/>
+          <w:color w:val="000000"/>
+          <w:sz w:val="28"/>
+        </w:rPr>
+        <w:t>Кожен перехід позначено подією, що його спричиняє, а ініціатор події відповідає актору діаграми прецедентів: створення місії — офіцеру бойового управління (UC-04), санкція або відмова — оперативному черговому (UC-07), підтвердження — командиру розрахунку (UC-08), доповідь про результат — прецеденту UC-11, скасування — прецеденту UC-10. Перехід «немає підтвердження 15 с» ініціює сама система за таймером; він реалізує розширення «UC-06 Обрати резервний розрахунок». Цикл «Санкціонована — Перепризначена — Запропонована» гарантує, що зміна розрахунку потребує нової санкції оперативного чергового, тобто призначення не обходить людину. Перелік станів діаграми безпосередньо використано як множину допустимих значень стовпця state таблиці mission фізичної моделі (п. 2.6).</w:t>
+      </w:r>
+    </w:p>
+    <w:p>
+      <w:pPr>
         <w:pStyle w:val="829"/>
         <w:keepNext/>
         <w:pageBreakBefore w:val="0"/>
@@ -3899,6 +4501,44 @@
     </w:p>
     <w:p>
       <w:pPr>
+        <w:keepNext w:val="0"/>
+        <w:widowControl/>
+        <w:spacing w:line="360" w:lineRule="auto" w:before="0" w:after="0"/>
+        <w:ind w:firstLine="709" w:left="0"/>
+        <w:jc w:val="both"/>
+      </w:pPr>
+      <w:r>
+        <w:rPr>
+          <w:rFonts w:ascii="Times New Roman" w:hAnsi="Times New Roman" w:cs="Times New Roman" w:eastAsia="Times New Roman"/>
+          <w:b w:val="0"/>
+          <w:i w:val="0"/>
+          <w:color w:val="000000"/>
+          <w:sz w:val="28"/>
+        </w:rPr>
+        <w:t>Між класами встановлено відношення трьох видів. Направлена асоціація «формує» від класу «Сенсор» до класу «Виявлення» з кратністю 1 — * означає, що кожне виявлення має рівно одне джерело, а один сенсор формує необмежену кількість виявлень; напрямок вказує, що виявлення не знає про подальшу обробку. Агрегація (незафарбований ромб) між класами «ПовітрянийТрек» і «Виявлення» відображає відношення «ціле — частина», за якого частини існують незалежно: виявлення зберігаються для аналізу навіть після закриття треку. Композиція (зафарбований ромб) між класами «Місія» і «ЗвітПроПерехоплення» є сильнішою формою агрегації: звіт створюється лише для конкретної місії та видаляється разом з нею.</w:t>
+      </w:r>
+    </w:p>
+    <w:p>
+      <w:pPr>
+        <w:keepNext w:val="0"/>
+        <w:widowControl/>
+        <w:spacing w:line="360" w:lineRule="auto" w:before="0" w:after="0"/>
+        <w:ind w:firstLine="709" w:left="0"/>
+        <w:jc w:val="both"/>
+      </w:pPr>
+      <w:r>
+        <w:rPr>
+          <w:rFonts w:ascii="Times New Roman" w:hAnsi="Times New Roman" w:cs="Times New Roman" w:eastAsia="Times New Roman"/>
+          <w:b w:val="0"/>
+          <w:i w:val="0"/>
+          <w:color w:val="000000"/>
+          <w:sz w:val="28"/>
+        </w:rPr>
+        <w:t>Клас «Місія» є центральним: він пов’язаний асоціаціями з п’ятьма іншими класами. Кратність 0..* на боці місії в асоціації «ціль» з класом «ПовітрянийТрек» допускає трек без місій (ціль під спостереженням) і повторне призначення на ту саму ціль після промаху. Кратність 0..1 на боці класу «Перехоплювач» означає, що до пуску перехоплювач місії не визначено, а після пуску застосовується рівно один. Асоціація «санкціонує» з класом «Користувач» фіксує персональну відповідальність посадової особи за кожен пуск. Атрибути класів наведено без типів, оскільки на концептуальному рівні важливий склад даних, а не спосіб їх зберігання; типи визначаються у фізичній моделі (рис. 4.11).</w:t>
+      </w:r>
+    </w:p>
+    <w:p>
+      <w:pPr>
         <w:pStyle w:val="828"/>
         <w:keepNext/>
         <w:pageBreakBefore w:val="0"/>
@@ -4039,6 +4679,215 @@
           <w:sz w:val="28"/>
         </w:rPr>
         <w:t>Рис. 4.8 — Діаграма діяльності сценарію «Призначення розрахунку»</w:t>
+      </w:r>
+    </w:p>
+    <w:p>
+      <w:pPr>
+        <w:keepNext w:val="0"/>
+        <w:widowControl/>
+        <w:spacing w:line="360" w:lineRule="auto" w:before="0" w:after="0"/>
+        <w:ind w:firstLine="709" w:left="0"/>
+        <w:jc w:val="both"/>
+      </w:pPr>
+      <w:r>
+        <w:rPr>
+          <w:rFonts w:ascii="Times New Roman" w:hAnsi="Times New Roman" w:cs="Times New Roman" w:eastAsia="Times New Roman"/>
+          <w:b w:val="0"/>
+          <w:i w:val="0"/>
+          <w:color w:val="000000"/>
+          <w:sz w:val="28"/>
+        </w:rPr>
+        <w:t>Діаграма побудована з таких елементів: початкового вузла (зафарбоване коло), дій (прямокутники із заокругленими кутами), вузлів розгалуження (ромби з умовою та гілками «так» / «ні») і кінцевих вузлів (коло з обідком). Доріжки (swimlanes) показують, хто відповідає за кожну дію, тому перехід потоку управління між доріжками означає передачу відповідальності між учасниками. Послідовність дій така:</w:t>
+      </w:r>
+    </w:p>
+    <w:p>
+      <w:pPr>
+        <w:keepNext w:val="0"/>
+        <w:widowControl/>
+        <w:spacing w:line="360" w:lineRule="auto" w:before="0" w:after="0"/>
+        <w:ind w:firstLine="709" w:left="0"/>
+        <w:jc w:val="both"/>
+      </w:pPr>
+      <w:r>
+        <w:rPr>
+          <w:rFonts w:ascii="Times New Roman" w:hAnsi="Times New Roman" w:cs="Times New Roman" w:eastAsia="Times New Roman"/>
+          <w:b w:val="0"/>
+          <w:i w:val="0"/>
+          <w:color w:val="000000"/>
+          <w:sz w:val="28"/>
+        </w:rPr>
+        <w:t>1) Дія «Обрати ціль» у доріжці ОБУ — офіцер обирає повітряний трек із черги на перехоплення.</w:t>
+      </w:r>
+    </w:p>
+    <w:p>
+      <w:pPr>
+        <w:keepNext w:val="0"/>
+        <w:widowControl/>
+        <w:spacing w:line="360" w:lineRule="auto" w:before="0" w:after="0"/>
+        <w:ind w:firstLine="709" w:left="0"/>
+        <w:jc w:val="both"/>
+      </w:pPr>
+      <w:r>
+        <w:rPr>
+          <w:rFonts w:ascii="Times New Roman" w:hAnsi="Times New Roman" w:cs="Times New Roman" w:eastAsia="Times New Roman"/>
+          <w:b w:val="0"/>
+          <w:i w:val="0"/>
+          <w:color w:val="000000"/>
+          <w:sz w:val="28"/>
+        </w:rPr>
+        <w:t>2) Дія «Підібрати кандидатів, деконфлікція» у доріжці платформи — сервіс призначення формує перелік розрахунків, здатних досягти цілі, і перевіряє відсутність конфлікту з дружньою авіацією.</w:t>
+      </w:r>
+    </w:p>
+    <w:p>
+      <w:pPr>
+        <w:keepNext w:val="0"/>
+        <w:widowControl/>
+        <w:spacing w:line="360" w:lineRule="auto" w:before="0" w:after="0"/>
+        <w:ind w:firstLine="709" w:left="0"/>
+        <w:jc w:val="both"/>
+      </w:pPr>
+      <w:r>
+        <w:rPr>
+          <w:rFonts w:ascii="Times New Roman" w:hAnsi="Times New Roman" w:cs="Times New Roman" w:eastAsia="Times New Roman"/>
+          <w:b w:val="0"/>
+          <w:i w:val="0"/>
+          <w:color w:val="000000"/>
+          <w:sz w:val="28"/>
+        </w:rPr>
+        <w:t>3) Розгалуження «Пройдено?»: за наявності конфлікту виконується кінцевий вузол — призначення блокується і місія не створюється.</w:t>
+      </w:r>
+    </w:p>
+    <w:p>
+      <w:pPr>
+        <w:keepNext w:val="0"/>
+        <w:widowControl/>
+        <w:spacing w:line="360" w:lineRule="auto" w:before="0" w:after="0"/>
+        <w:ind w:firstLine="709" w:left="0"/>
+        <w:jc w:val="both"/>
+      </w:pPr>
+      <w:r>
+        <w:rPr>
+          <w:rFonts w:ascii="Times New Roman" w:hAnsi="Times New Roman" w:cs="Times New Roman" w:eastAsia="Times New Roman"/>
+          <w:b w:val="0"/>
+          <w:i w:val="0"/>
+          <w:color w:val="000000"/>
+          <w:sz w:val="28"/>
+        </w:rPr>
+        <w:t>4) Дія «Обрати розрахунок» у доріжці ОБУ — офіцер обирає одного з запропонованих кандидатів.</w:t>
+      </w:r>
+    </w:p>
+    <w:p>
+      <w:pPr>
+        <w:keepNext w:val="0"/>
+        <w:widowControl/>
+        <w:spacing w:line="360" w:lineRule="auto" w:before="0" w:after="0"/>
+        <w:ind w:firstLine="709" w:left="0"/>
+        <w:jc w:val="both"/>
+      </w:pPr>
+      <w:r>
+        <w:rPr>
+          <w:rFonts w:ascii="Times New Roman" w:hAnsi="Times New Roman" w:cs="Times New Roman" w:eastAsia="Times New Roman"/>
+          <w:b w:val="0"/>
+          <w:i w:val="0"/>
+          <w:color w:val="000000"/>
+          <w:sz w:val="28"/>
+        </w:rPr>
+        <w:t>5) Дія «Створити місію» у доріжці платформи — місія отримує стан «Запропонована».</w:t>
+      </w:r>
+    </w:p>
+    <w:p>
+      <w:pPr>
+        <w:keepNext w:val="0"/>
+        <w:widowControl/>
+        <w:spacing w:line="360" w:lineRule="auto" w:before="0" w:after="0"/>
+        <w:ind w:firstLine="709" w:left="0"/>
+        <w:jc w:val="both"/>
+      </w:pPr>
+      <w:r>
+        <w:rPr>
+          <w:rFonts w:ascii="Times New Roman" w:hAnsi="Times New Roman" w:cs="Times New Roman" w:eastAsia="Times New Roman"/>
+          <w:b w:val="0"/>
+          <w:i w:val="0"/>
+          <w:color w:val="000000"/>
+          <w:sz w:val="28"/>
+        </w:rPr>
+        <w:t>6) Розгалуження «Санкція?» у доріжці ОЧ: за відмови сценарій завершується, місія переходить у стан «Відхилена».</w:t>
+      </w:r>
+    </w:p>
+    <w:p>
+      <w:pPr>
+        <w:keepNext w:val="0"/>
+        <w:widowControl/>
+        <w:spacing w:line="360" w:lineRule="auto" w:before="0" w:after="0"/>
+        <w:ind w:firstLine="709" w:left="0"/>
+        <w:jc w:val="both"/>
+      </w:pPr>
+      <w:r>
+        <w:rPr>
+          <w:rFonts w:ascii="Times New Roman" w:hAnsi="Times New Roman" w:cs="Times New Roman" w:eastAsia="Times New Roman"/>
+          <w:b w:val="0"/>
+          <w:i w:val="0"/>
+          <w:color w:val="000000"/>
+          <w:sz w:val="28"/>
+        </w:rPr>
+        <w:t>7) Дія «Надіслати завдання» у доріжці платформи — бойове завдання доставляється на планшет розрахунку.</w:t>
+      </w:r>
+    </w:p>
+    <w:p>
+      <w:pPr>
+        <w:keepNext w:val="0"/>
+        <w:widowControl/>
+        <w:spacing w:line="360" w:lineRule="auto" w:before="0" w:after="0"/>
+        <w:ind w:firstLine="709" w:left="0"/>
+        <w:jc w:val="both"/>
+      </w:pPr>
+      <w:r>
+        <w:rPr>
+          <w:rFonts w:ascii="Times New Roman" w:hAnsi="Times New Roman" w:cs="Times New Roman" w:eastAsia="Times New Roman"/>
+          <w:b w:val="0"/>
+          <w:i w:val="0"/>
+          <w:color w:val="000000"/>
+          <w:sz w:val="28"/>
+        </w:rPr>
+        <w:t>8) Розгалуження «Прийнято за 15 с?» у доріжці розрахунку: гілка «так» веде до дії «Прийняти завдання», гілка «ні» — до дії платформи «Резервний розрахунок», після якої поточний сценарій завершується і запускається повторно з новим кандидатом.</w:t>
+      </w:r>
+    </w:p>
+    <w:p>
+      <w:pPr>
+        <w:keepNext w:val="0"/>
+        <w:widowControl/>
+        <w:spacing w:line="360" w:lineRule="auto" w:before="0" w:after="0"/>
+        <w:ind w:firstLine="709" w:left="0"/>
+        <w:jc w:val="both"/>
+      </w:pPr>
+      <w:r>
+        <w:rPr>
+          <w:rFonts w:ascii="Times New Roman" w:hAnsi="Times New Roman" w:cs="Times New Roman" w:eastAsia="Times New Roman"/>
+          <w:b w:val="0"/>
+          <w:i w:val="0"/>
+          <w:color w:val="000000"/>
+          <w:sz w:val="28"/>
+        </w:rPr>
+        <w:t>9) Дія «Супроводжувати місію» у доріжці платформи та кінцевий вузол завершують основний потік.</w:t>
+      </w:r>
+    </w:p>
+    <w:p>
+      <w:pPr>
+        <w:keepNext w:val="0"/>
+        <w:widowControl/>
+        <w:spacing w:line="360" w:lineRule="auto" w:before="0" w:after="0"/>
+        <w:ind w:firstLine="709" w:left="0"/>
+        <w:jc w:val="both"/>
+      </w:pPr>
+      <w:r>
+        <w:rPr>
+          <w:rFonts w:ascii="Times New Roman" w:hAnsi="Times New Roman" w:cs="Times New Roman" w:eastAsia="Times New Roman"/>
+          <w:b w:val="0"/>
+          <w:i w:val="0"/>
+          <w:color w:val="000000"/>
+          <w:sz w:val="28"/>
+        </w:rPr>
+        <w:t>Діаграма містить чотири кінцеві вузли, кожен з яких відповідає окремому результату сценарію. Така структура дає змогу безпосередньо отримати з діаграми тестові сценарії: по одному на кожен шлях від початкового до кінцевого вузла.</w:t>
       </w:r>
     </w:p>
     <w:p>
@@ -4435,7 +5284,26 @@
           <w:color w:val="000000"/>
           <w:sz w:val="28"/>
         </w:rPr>
-        <w:t>Синхронні виклики (суцільні стрілки) використовуються лише всередині ядра, а взаємодія з ОЧ і планшетом відбувається через шину подій, що відповідає подієво-орієнтованій архітектурі ПР2 [5].</w:t>
+        <w:t>Учасники взаємодії розташовані горизонтально в порядку першої участі: актор «ОБУ», об’єкти «АРМ КП» (інтерфейс користувача), «Призначення і місії» (сервіс, що керує сценарієм) і «Геосервіс», черга «Шина подій», актор «ОЧ» та «Планшет» розрахунку. Вертикальні пунктирні лінії (лінії життя) відображають існування об’єктів протягом сценарію; час на діаграмі плине згори донизу. Суцільні стрілки із зафарбованим наконечником позначають виклики операцій, пунктирні — повернення результату (відповіді «дозволено», «кандидати», «стан місії»). Повідомлення, взяті в лапки («місію запропоновано», «місію санкціоновано», «завдання прийнято»), є подіями, які публікуються в шину і доставляються підписникам.</w:t>
+      </w:r>
+    </w:p>
+    <w:p>
+      <w:pPr>
+        <w:keepNext w:val="0"/>
+        <w:widowControl/>
+        <w:spacing w:line="360" w:lineRule="auto" w:before="0" w:after="0"/>
+        <w:ind w:firstLine="709" w:left="0"/>
+        <w:jc w:val="both"/>
+      </w:pPr>
+      <w:r>
+        <w:rPr>
+          <w:rFonts w:ascii="Times New Roman" w:hAnsi="Times New Roman" w:cs="Times New Roman" w:eastAsia="Times New Roman"/>
+          <w:b w:val="0"/>
+          <w:i w:val="0"/>
+          <w:color w:val="000000"/>
+          <w:sz w:val="28"/>
+        </w:rPr>
+        <w:t>Синхронні виклики з очікуванням відповіді використовуються лише всередині ядра — між АРМ, сервісом призначення та геосервісом, — оскільки результат деконфлікції потрібен до продовження сценарію. Взаємодія з ОЧ і планшетом відбувається асинхронно через шину подій: сервіс призначення не очікує санкції, а реагує на подію, коли вона надходить. Такий розподіл відповідає подієво-орієнтованій архітектурі ПР2 [5] і дає змогу планшету отримати завдання навіть після тимчасової втрати зв’язку, оскільки подія зберігається в шині до доставки.</w:t>
       </w:r>
     </w:p>
     <w:p>
@@ -4799,6 +5667,44 @@
     </w:p>
     <w:p>
       <w:pPr>
+        <w:keepNext w:val="0"/>
+        <w:widowControl/>
+        <w:spacing w:line="360" w:lineRule="auto" w:before="0" w:after="0"/>
+        <w:ind w:firstLine="709" w:left="0"/>
+        <w:jc w:val="both"/>
+      </w:pPr>
+      <w:r>
+        <w:rPr>
+          <w:rFonts w:ascii="Times New Roman" w:hAnsi="Times New Roman" w:cs="Times New Roman" w:eastAsia="Times New Roman"/>
+          <w:b w:val="0"/>
+          <w:i w:val="0"/>
+          <w:color w:val="000000"/>
+          <w:sz w:val="28"/>
+        </w:rPr>
+        <w:t>Об’єкти діаграми позначено в нотації «ім’я : клас»: іменовані об’єкти «ОБУ : Офіцер» та «ОЧ : Оперативний черговий» відповідають акторам діаграми прецедентів, анонімні об’єкти (з двокрапкою перед іменем класу) — екземплярам класів концептуальної моделі та сервісам ядра. Лінії між об’єктами є зв’язками (links), тобто екземплярами асоціацій діаграми класів; уздовж кожного зв’язку показано номер, напрямок і назву повідомлення.</w:t>
+      </w:r>
+    </w:p>
+    <w:p>
+      <w:pPr>
+        <w:keepNext w:val="0"/>
+        <w:widowControl/>
+        <w:spacing w:line="360" w:lineRule="auto" w:before="0" w:after="0"/>
+        <w:ind w:firstLine="709" w:left="0"/>
+        <w:jc w:val="both"/>
+      </w:pPr>
+      <w:r>
+        <w:rPr>
+          <w:rFonts w:ascii="Times New Roman" w:hAnsi="Times New Roman" w:cs="Times New Roman" w:eastAsia="Times New Roman"/>
+          <w:b w:val="0"/>
+          <w:i w:val="0"/>
+          <w:color w:val="000000"/>
+          <w:sz w:val="28"/>
+        </w:rPr>
+        <w:t>На відміну від діаграми послідовності, яка робить наочним порядок повідомлень у часі, діаграма кооперації показує структуру зв’язків: з неї видно, що об’єкт «Місія» має шість зв’язків і є єдиною точкою узгодження сценарію, тоді як «Розрахунок» взаємодіє з місією лише опосередковано — через планшет. Повідомлення 2 і 3 генерує сама місія, тобто перевірка загрози та деконфлікції інкапсульована в класі «Місія», а не покладена на користувача. Обидві діаграми взаємодії описують той самий сценарій і можуть бути перетворені одна в одну.</w:t>
+      </w:r>
+    </w:p>
+    <w:p>
+      <w:pPr>
         <w:pStyle w:val="828"/>
         <w:keepNext/>
         <w:pageBreakBefore w:val="0"/>
@@ -4965,6 +5871,158 @@
     </w:p>
     <w:p>
       <w:pPr>
+        <w:keepNext w:val="0"/>
+        <w:widowControl/>
+        <w:spacing w:line="360" w:lineRule="auto" w:before="0" w:after="0"/>
+        <w:ind w:firstLine="709" w:left="0"/>
+        <w:jc w:val="both"/>
+      </w:pPr>
+      <w:r>
+        <w:rPr>
+          <w:rFonts w:ascii="Times New Roman" w:hAnsi="Times New Roman" w:cs="Times New Roman" w:eastAsia="Times New Roman"/>
+          <w:b w:val="0"/>
+          <w:i w:val="0"/>
+          <w:color w:val="000000"/>
+          <w:sz w:val="28"/>
+        </w:rPr>
+        <w:t>Перехід від концептуальної моделі до фізичної виконано за такими правилами:</w:t>
+      </w:r>
+    </w:p>
+    <w:p>
+      <w:pPr>
+        <w:keepNext w:val="0"/>
+        <w:widowControl/>
+        <w:spacing w:line="360" w:lineRule="auto" w:before="0" w:after="0"/>
+        <w:ind w:firstLine="709" w:left="0"/>
+        <w:jc w:val="both"/>
+      </w:pPr>
+      <w:r>
+        <w:rPr>
+          <w:rFonts w:ascii="Times New Roman" w:hAnsi="Times New Roman" w:cs="Times New Roman" w:eastAsia="Times New Roman"/>
+          <w:b w:val="0"/>
+          <w:i w:val="0"/>
+          <w:color w:val="000000"/>
+          <w:sz w:val="28"/>
+        </w:rPr>
+        <w:t>– кожен клас предметної області, екземпляри якого зберігаються, перетворено на таблицю з англомовним ідентифікатором (клас «Місія» — таблиця mission, «ПовітрянийТрек» — air_track, «Користувач» — personnel тощо);</w:t>
+      </w:r>
+    </w:p>
+    <w:p>
+      <w:pPr>
+        <w:keepNext w:val="0"/>
+        <w:widowControl/>
+        <w:spacing w:line="360" w:lineRule="auto" w:before="0" w:after="0"/>
+        <w:ind w:firstLine="709" w:left="0"/>
+        <w:jc w:val="both"/>
+      </w:pPr>
+      <w:r>
+        <w:rPr>
+          <w:rFonts w:ascii="Times New Roman" w:hAnsi="Times New Roman" w:cs="Times New Roman" w:eastAsia="Times New Roman"/>
+          <w:b w:val="0"/>
+          <w:i w:val="0"/>
+          <w:color w:val="000000"/>
+          <w:sz w:val="28"/>
+        </w:rPr>
+        <w:t>– кожна таблиця отримала сурогатний первинний ключ типу UUID, що генерується без звернення до центрального лічильника і тому придатний для розподіленої системи з кількома ЦОД;</w:t>
+      </w:r>
+    </w:p>
+    <w:p>
+      <w:pPr>
+        <w:keepNext w:val="0"/>
+        <w:widowControl/>
+        <w:spacing w:line="360" w:lineRule="auto" w:before="0" w:after="0"/>
+        <w:ind w:firstLine="709" w:left="0"/>
+        <w:jc w:val="both"/>
+      </w:pPr>
+      <w:r>
+        <w:rPr>
+          <w:rFonts w:ascii="Times New Roman" w:hAnsi="Times New Roman" w:cs="Times New Roman" w:eastAsia="Times New Roman"/>
+          <w:b w:val="0"/>
+          <w:i w:val="0"/>
+          <w:color w:val="000000"/>
+          <w:sz w:val="28"/>
+        </w:rPr>
+        <w:t>– асоціації з кратністю «1 — багато» перетворено на зовнішні ключі на боці «багато»: таблиця mission містить track_id, crew_id, interceptor_id та approved_by;</w:t>
+      </w:r>
+    </w:p>
+    <w:p>
+      <w:pPr>
+        <w:keepNext w:val="0"/>
+        <w:widowControl/>
+        <w:spacing w:line="360" w:lineRule="auto" w:before="0" w:after="0"/>
+        <w:ind w:firstLine="709" w:left="0"/>
+        <w:jc w:val="both"/>
+      </w:pPr>
+      <w:r>
+        <w:rPr>
+          <w:rFonts w:ascii="Times New Roman" w:hAnsi="Times New Roman" w:cs="Times New Roman" w:eastAsia="Times New Roman"/>
+          <w:b w:val="0"/>
+          <w:i w:val="0"/>
+          <w:color w:val="000000"/>
+          <w:sz w:val="28"/>
+        </w:rPr>
+        <w:t>– кратність 0..1 перетворено на стовпець, що допускає порожнє значення (interceptor_id до пуску), а композицію «Місія — Звіт» — на зовнішній ключ mission_id у таблиці engagement_report з обмеженням унікальності, що забезпечує відношення 1 : 0..1;</w:t>
+      </w:r>
+    </w:p>
+    <w:p>
+      <w:pPr>
+        <w:keepNext w:val="0"/>
+        <w:widowControl/>
+        <w:spacing w:line="360" w:lineRule="auto" w:before="0" w:after="0"/>
+        <w:ind w:firstLine="709" w:left="0"/>
+        <w:jc w:val="both"/>
+      </w:pPr>
+      <w:r>
+        <w:rPr>
+          <w:rFonts w:ascii="Times New Roman" w:hAnsi="Times New Roman" w:cs="Times New Roman" w:eastAsia="Times New Roman"/>
+          <w:b w:val="0"/>
+          <w:i w:val="0"/>
+          <w:color w:val="000000"/>
+          <w:sz w:val="28"/>
+        </w:rPr>
+        <w:t>– атрибути з обмеженою множиною значень (належність треку, стан місії, оцінка результату) отримали тип ENUM; перелік станів місії збігається зі станами діаграми на рис. 4.6;</w:t>
+      </w:r>
+    </w:p>
+    <w:p>
+      <w:pPr>
+        <w:keepNext w:val="0"/>
+        <w:widowControl/>
+        <w:spacing w:line="360" w:lineRule="auto" w:before="0" w:after="0"/>
+        <w:ind w:firstLine="709" w:left="0"/>
+        <w:jc w:val="both"/>
+      </w:pPr>
+      <w:r>
+        <w:rPr>
+          <w:rFonts w:ascii="Times New Roman" w:hAnsi="Times New Roman" w:cs="Times New Roman" w:eastAsia="Times New Roman"/>
+          <w:b w:val="0"/>
+          <w:i w:val="0"/>
+          <w:color w:val="000000"/>
+          <w:sz w:val="28"/>
+        </w:rPr>
+        <w:t>– моменти часу зберігаються в типі TIMESTAMPTZ з часовим поясом, оскільки події надходять від вузлів, розташованих у різних місцях, а журнал має бути однозначно впорядкований.</w:t>
+      </w:r>
+    </w:p>
+    <w:p>
+      <w:pPr>
+        <w:keepNext w:val="0"/>
+        <w:widowControl/>
+        <w:spacing w:line="360" w:lineRule="auto" w:before="0" w:after="0"/>
+        <w:ind w:firstLine="709" w:left="0"/>
+        <w:jc w:val="both"/>
+      </w:pPr>
+      <w:r>
+        <w:rPr>
+          <w:rFonts w:ascii="Times New Roman" w:hAnsi="Times New Roman" w:cs="Times New Roman" w:eastAsia="Times New Roman"/>
+          <w:b w:val="0"/>
+          <w:i w:val="0"/>
+          <w:color w:val="000000"/>
+          <w:sz w:val="28"/>
+        </w:rPr>
+        <w:t>Зовнішні ключі position_id і role_id посилаються на таблиці «Позиція» та «Роль», які не наведені у фрагменті, щоб діаграма залишалася читабельною.</w:t>
+      </w:r>
+    </w:p>
+    <w:p>
+      <w:pPr>
         <w:pStyle w:val="829"/>
         <w:keepNext/>
         <w:pageBreakBefore w:val="0"/>
@@ -5067,6 +6125,161 @@
     </w:p>
     <w:p>
       <w:pPr>
+        <w:keepNext w:val="0"/>
+        <w:widowControl/>
+        <w:spacing w:line="360" w:lineRule="auto" w:before="0" w:after="0"/>
+        <w:ind w:firstLine="709" w:left="0"/>
+        <w:jc w:val="both"/>
+      </w:pPr>
+      <w:r>
+        <w:rPr>
+          <w:rFonts w:ascii="Times New Roman" w:hAnsi="Times New Roman" w:cs="Times New Roman" w:eastAsia="Times New Roman"/>
+          <w:b w:val="0"/>
+          <w:i w:val="0"/>
+          <w:color w:val="000000"/>
+          <w:sz w:val="28"/>
+        </w:rPr>
+        <w:t>Стрілки залежностей на діаграмі показують напрямок звернення одного компонента до іншого і разом утворюють такі маршрути даних:</w:t>
+      </w:r>
+    </w:p>
+    <w:p>
+      <w:pPr>
+        <w:keepNext w:val="0"/>
+        <w:widowControl/>
+        <w:spacing w:line="360" w:lineRule="auto" w:before="0" w:after="0"/>
+        <w:ind w:firstLine="709" w:left="0"/>
+        <w:jc w:val="both"/>
+      </w:pPr>
+      <w:r>
+        <w:rPr>
+          <w:rFonts w:ascii="Times New Roman" w:hAnsi="Times New Roman" w:cs="Times New Roman" w:eastAsia="Times New Roman"/>
+          <w:b w:val="0"/>
+          <w:i w:val="0"/>
+          <w:color w:val="000000"/>
+          <w:sz w:val="28"/>
+        </w:rPr>
+        <w:t xml:space="preserve">– </w:t>
+      </w:r>
+      <w:r>
+        <w:rPr>
+          <w:rFonts w:ascii="Times New Roman" w:hAnsi="Times New Roman" w:cs="Times New Roman" w:eastAsia="Times New Roman"/>
+          <w:b/>
+          <w:i w:val="0"/>
+          <w:color w:val="000000"/>
+          <w:sz w:val="28"/>
+        </w:rPr>
+        <w:t>висхідний потік телеметрії:</w:t>
+      </w:r>
+      <w:r>
+        <w:rPr>
+          <w:rFonts w:ascii="Times New Roman" w:hAnsi="Times New Roman" w:cs="Times New Roman" w:eastAsia="Times New Roman"/>
+          <w:b w:val="0"/>
+          <w:i w:val="0"/>
+          <w:color w:val="000000"/>
+          <w:sz w:val="28"/>
+        </w:rPr>
+        <w:t xml:space="preserve"> адаптери протоколів приймають повідомлення сенсорів і перетворюють їх у єдиний формат, локальний брокер MQTT розподіляє їх на позиції, а компонент «Буфер і міст до ядра» зберігає повідомлення під час втрати зв’язку та передає їх до шини подій ядра;</w:t>
+      </w:r>
+    </w:p>
+    <w:p>
+      <w:pPr>
+        <w:keepNext w:val="0"/>
+        <w:widowControl/>
+        <w:spacing w:line="360" w:lineRule="auto" w:before="0" w:after="0"/>
+        <w:ind w:firstLine="709" w:left="0"/>
+        <w:jc w:val="both"/>
+      </w:pPr>
+      <w:r>
+        <w:rPr>
+          <w:rFonts w:ascii="Times New Roman" w:hAnsi="Times New Roman" w:cs="Times New Roman" w:eastAsia="Times New Roman"/>
+          <w:b w:val="0"/>
+          <w:i w:val="0"/>
+          <w:color w:val="000000"/>
+          <w:sz w:val="28"/>
+        </w:rPr>
+        <w:t xml:space="preserve">– </w:t>
+      </w:r>
+      <w:r>
+        <w:rPr>
+          <w:rFonts w:ascii="Times New Roman" w:hAnsi="Times New Roman" w:cs="Times New Roman" w:eastAsia="Times New Roman"/>
+          <w:b/>
+          <w:i w:val="0"/>
+          <w:color w:val="000000"/>
+          <w:sz w:val="28"/>
+        </w:rPr>
+        <w:t>обробка в ядрі:</w:t>
+      </w:r>
+      <w:r>
+        <w:rPr>
+          <w:rFonts w:ascii="Times New Roman" w:hAnsi="Times New Roman" w:cs="Times New Roman" w:eastAsia="Times New Roman"/>
+          <w:b w:val="0"/>
+          <w:i w:val="0"/>
+          <w:color w:val="000000"/>
+          <w:sz w:val="28"/>
+        </w:rPr>
+        <w:t xml:space="preserve"> шина подій доставляє події двом групам підписників — сервісам реального часу (злиття треків, оцінка загрози) та бізнес-сервісам (призначення, місії, облік ресурсів); обидві групи зберігають дані в реляційному сховищі PostgreSQL і часовому сховищі TimescaleDB;</w:t>
+      </w:r>
+    </w:p>
+    <w:p>
+      <w:pPr>
+        <w:keepNext w:val="0"/>
+        <w:widowControl/>
+        <w:spacing w:line="360" w:lineRule="auto" w:before="0" w:after="0"/>
+        <w:ind w:firstLine="709" w:left="0"/>
+        <w:jc w:val="both"/>
+      </w:pPr>
+      <w:r>
+        <w:rPr>
+          <w:rFonts w:ascii="Times New Roman" w:hAnsi="Times New Roman" w:cs="Times New Roman" w:eastAsia="Times New Roman"/>
+          <w:b w:val="0"/>
+          <w:i w:val="0"/>
+          <w:color w:val="000000"/>
+          <w:sz w:val="28"/>
+        </w:rPr>
+        <w:t xml:space="preserve">– </w:t>
+      </w:r>
+      <w:r>
+        <w:rPr>
+          <w:rFonts w:ascii="Times New Roman" w:hAnsi="Times New Roman" w:cs="Times New Roman" w:eastAsia="Times New Roman"/>
+          <w:b/>
+          <w:i w:val="0"/>
+          <w:color w:val="000000"/>
+          <w:sz w:val="28"/>
+        </w:rPr>
+        <w:t>доступ користувачів:</w:t>
+      </w:r>
+      <w:r>
+        <w:rPr>
+          <w:rFonts w:ascii="Times New Roman" w:hAnsi="Times New Roman" w:cs="Times New Roman" w:eastAsia="Times New Roman"/>
+          <w:b w:val="0"/>
+          <w:i w:val="0"/>
+          <w:color w:val="000000"/>
+          <w:sz w:val="28"/>
+        </w:rPr>
+        <w:t xml:space="preserve"> веб-АРМ і мобільний застосунок звертаються лише до API-шлюзу, який перевіряє права доступу й маршрутизує запити до сервісів; прямого звернення застосунків до бази даних немає.</w:t>
+      </w:r>
+    </w:p>
+    <w:p>
+      <w:pPr>
+        <w:keepNext w:val="0"/>
+        <w:widowControl/>
+        <w:spacing w:line="360" w:lineRule="auto" w:before="0" w:after="0"/>
+        <w:ind w:firstLine="709" w:left="0"/>
+        <w:jc w:val="both"/>
+      </w:pPr>
+      <w:r>
+        <w:rPr>
+          <w:rFonts w:ascii="Times New Roman" w:hAnsi="Times New Roman" w:cs="Times New Roman" w:eastAsia="Times New Roman"/>
+          <w:b w:val="0"/>
+          <w:i w:val="0"/>
+          <w:color w:val="000000"/>
+          <w:sz w:val="28"/>
+        </w:rPr>
+        <w:t>Така структура реалізує принцип слабкої зв’язаності: компоненти периферійного шлюзу не залежать від компонентів ядра, крім єдиної точки входу — шини подій, а застосунки залежать лише від інтерфейсу API-шлюзу. Заміна або масштабування окремого сервісу ядра не потребує змін у шлюзах і застосунках.</w:t>
+      </w:r>
+    </w:p>
+    <w:p>
+      <w:pPr>
         <w:pStyle w:val="829"/>
         <w:keepNext/>
         <w:pageBreakBefore w:val="0"/>
@@ -5278,7 +6491,978 @@
           <w:color w:val="000000"/>
           <w:sz w:val="28"/>
         </w:rPr>
+        <w:t>Вузли діаграми розгортання є фізичними обчислювальними ресурсами, на яких виконуються компоненти (рис. 4.12): пакет «Периферійний шлюз» розгортається на вузлі «Периферійний шлюз Jetson Orin Nano», пакет «IoT-ядро» — на вузлі «Кластер ядра» з базою даних, мобільний застосунок — на планшеті Android, а веб-АРМ — у браузері робочих місць командного пункту. Вкладеність вузлів означає фізичне розміщення: шлюз і планшет перебувають на тій самій позиції та з’єднані локальною мережею Wi-Fi, тому планшет розрахунку продовжує отримувати дані сенсорів сектора через локальний брокер шлюзу навіть за тимчасової відсутності каналу до ЦОД.</w:t>
+      </w:r>
+    </w:p>
+    <w:p>
+      <w:pPr>
+        <w:keepNext w:val="0"/>
+        <w:widowControl/>
+        <w:spacing w:line="360" w:lineRule="auto" w:before="0" w:after="0"/>
+        <w:ind w:firstLine="709" w:left="0"/>
+        <w:jc w:val="both"/>
+      </w:pPr>
+      <w:r>
+        <w:rPr>
+          <w:rFonts w:ascii="Times New Roman" w:hAnsi="Times New Roman" w:cs="Times New Roman" w:eastAsia="Times New Roman"/>
+          <w:b w:val="0"/>
+          <w:i w:val="0"/>
+          <w:color w:val="000000"/>
+          <w:sz w:val="28"/>
+        </w:rPr>
+        <w:t>Підписи на з’єднаннях між вузлами задають протоколи та засоби захисту каналів. Усі канали, що виходять за межі позиції або ЦОД, захищені: між шлюзом і ядром — віртуальна приватна мережа з взаємною автентифікацією за сертифікатами, між АРМ і ядром — протокол HTTPS. Реплікація даних до резервного ЦОД підтримує вимоги до доступності ядра (NFR-05, не менше 99,95 % на місяць) і відновлення (NFR-06, RPO не більше 5 с, RTO не більше 60 с), а розміщення шлюзу на позиції — вимогу автономної роботи шлюзу протягом не менше 4 год без зв’язку з ядром (FR-03, NFR-06) [4].</w:t>
+      </w:r>
+    </w:p>
+    <w:p>
+      <w:pPr>
+        <w:keepNext w:val="0"/>
+        <w:widowControl/>
+        <w:spacing w:line="360" w:lineRule="auto" w:before="0" w:after="0"/>
+        <w:ind w:firstLine="709" w:left="0"/>
+        <w:jc w:val="both"/>
+      </w:pPr>
+      <w:r>
+        <w:rPr>
+          <w:rFonts w:ascii="Times New Roman" w:hAnsi="Times New Roman" w:cs="Times New Roman" w:eastAsia="Times New Roman"/>
+          <w:b w:val="0"/>
+          <w:i w:val="0"/>
+          <w:color w:val="000000"/>
+          <w:sz w:val="28"/>
+        </w:rPr>
         <w:t>Взаємозв’язок вузлів і модулів, показаний на діаграмах компонентів і розгортання, узгоджується з IDEF0-моделлю (механізми M1–M3 на рис. 4.4) і з BPMN-моделями (доріжки «Периферійний шлюз» та «IoT-ядро» на рис. 4.1, 4.2).</w:t>
+      </w:r>
+    </w:p>
+    <w:p>
+      <w:pPr>
+        <w:pStyle w:val="828"/>
+        <w:keepNext/>
+        <w:pageBreakBefore w:val="0"/>
+        <w:widowControl/>
+        <w:spacing w:line="360" w:lineRule="auto" w:before="120" w:after="120"/>
+        <w:ind w:firstLine="709" w:left="0"/>
+        <w:jc w:val="left"/>
+      </w:pPr>
+      <w:bookmarkStart w:id="8" w:name="_Toc000008"/>
+      <w:r>
+        <w:rPr>
+          <w:rFonts w:ascii="Times New Roman" w:hAnsi="Times New Roman" w:cs="Times New Roman" w:eastAsia="Times New Roman"/>
+          <w:b/>
+          <w:i w:val="0"/>
+          <w:color w:val="000000"/>
+          <w:sz w:val="28"/>
+        </w:rPr>
+        <w:t>2.6. Реалізація моделей у CASE-засобах</w:t>
+      </w:r>
+      <w:bookmarkEnd w:id="8"/>
+    </w:p>
+    <w:p>
+      <w:pPr>
+        <w:keepNext w:val="0"/>
+        <w:widowControl/>
+        <w:spacing w:line="360" w:lineRule="auto" w:before="0" w:after="0"/>
+        <w:ind w:firstLine="709" w:left="0"/>
+        <w:jc w:val="both"/>
+      </w:pPr>
+      <w:r>
+        <w:rPr>
+          <w:rFonts w:ascii="Times New Roman" w:hAnsi="Times New Roman" w:cs="Times New Roman" w:eastAsia="Times New Roman"/>
+          <w:b w:val="0"/>
+          <w:i w:val="0"/>
+          <w:color w:val="000000"/>
+          <w:sz w:val="28"/>
+        </w:rPr>
+        <w:t>CASE-засоби (Computer-Aided Software Engineering) автоматизують аналіз і проектування програмних систем: побудову діаграм, перевірку їх узгодженості, підготовку проектної документації та генерацію програмного коду з моделей [2]. До засобів проектування та моделювання належать UML-інструменти (StarUML, Enterprise Architect) та інструменти для створення архітектури (Draw.io, Lucidchart); окрему категорію становлять системи керування версіями (Git), що відстежують зміни та зберігають історію [11].</w:t>
+      </w:r>
+    </w:p>
+    <w:p>
+      <w:pPr>
+        <w:keepNext w:val="0"/>
+        <w:widowControl/>
+        <w:spacing w:line="360" w:lineRule="auto" w:before="0" w:after="0"/>
+        <w:ind w:firstLine="709" w:left="0"/>
+        <w:jc w:val="both"/>
+      </w:pPr>
+      <w:r>
+        <w:rPr>
+          <w:rFonts w:ascii="Times New Roman" w:hAnsi="Times New Roman" w:cs="Times New Roman" w:eastAsia="Times New Roman"/>
+          <w:b w:val="0"/>
+          <w:i w:val="0"/>
+          <w:color w:val="000000"/>
+          <w:sz w:val="28"/>
+        </w:rPr>
+        <w:t>Для моделей розділу застосовано підхід «модель як код»: кожна діаграма зберігається у вигляді текстового опису моделі у стандартному або відкритому форматі, а зображення формуються автоматично. Перевагою підходу є можливість зберігати моделі в репозиторії Git разом з іншими артефактами проекту, порівнювати їх версії рядок за рядком і повторно формувати всі рисунки після зміни моделі без ручного перемальовування. Склад використаних засобів наведено в табл. 4.2.</w:t>
+      </w:r>
+    </w:p>
+    <w:p>
+      <w:pPr>
+        <w:keepNext/>
+        <w:pageBreakBefore/>
+        <w:widowControl/>
+        <w:spacing w:line="360" w:lineRule="auto" w:before="120" w:after="0"/>
+        <w:ind w:firstLine="0" w:left="0"/>
+        <w:jc w:val="left"/>
+      </w:pPr>
+      <w:r>
+        <w:rPr>
+          <w:rFonts w:ascii="Times New Roman" w:hAnsi="Times New Roman" w:cs="Times New Roman" w:eastAsia="Times New Roman"/>
+          <w:b w:val="0"/>
+          <w:i w:val="0"/>
+          <w:color w:val="000000"/>
+          <w:sz w:val="28"/>
+        </w:rPr>
+        <w:t>Таблиця 4.2 — Засоби моделювання, використані в розділі</w:t>
+      </w:r>
+    </w:p>
+    <w:tbl>
+      <w:tblPr>
+        <w:tblW w:type="auto" w:w="0"/>
+        <w:jc w:val="center"/>
+        <w:tblLayout w:type="fixed"/>
+        <w:tblLook w:firstColumn="1" w:firstRow="1" w:lastColumn="0" w:lastRow="0" w:noHBand="0" w:noVBand="1" w:val="04A0"/>
+        <w:tblBorders>
+          <w:top w:val="single" w:sz="6" w:space="0" w:color="000000"/>
+          <w:left w:val="single" w:sz="6" w:space="0" w:color="000000"/>
+          <w:bottom w:val="single" w:sz="6" w:space="0" w:color="000000"/>
+          <w:right w:val="single" w:sz="6" w:space="0" w:color="000000"/>
+          <w:insideH w:val="single" w:sz="6" w:space="0" w:color="000000"/>
+          <w:insideV w:val="single" w:sz="6" w:space="0" w:color="000000"/>
+        </w:tblBorders>
+      </w:tblPr>
+      <w:tblGrid>
+        <w:gridCol w:w="2339"/>
+        <w:gridCol w:w="2339"/>
+        <w:gridCol w:w="2339"/>
+        <w:gridCol w:w="2339"/>
+      </w:tblGrid>
+      <w:tr>
+        <w:trPr>
+          <w:tblHeader w:val="true"/>
+          <w:cantSplit w:val="true"/>
+        </w:trPr>
+        <w:tc>
+          <w:tcPr>
+            <w:tcW w:type="dxa" w:w="1520"/>
+          </w:tcPr>
+          <w:p>
+            <w:pPr>
+              <w:keepNext/>
+              <w:widowControl/>
+              <w:spacing w:line="240" w:lineRule="auto" w:before="0" w:after="0"/>
+              <w:ind w:firstLine="0" w:left="0"/>
+              <w:jc w:val="center"/>
+            </w:pPr>
+            <w:r/>
+            <w:r>
+              <w:rPr>
+                <w:rFonts w:ascii="Times New Roman" w:hAnsi="Times New Roman" w:cs="Times New Roman" w:eastAsia="Times New Roman"/>
+                <w:b/>
+                <w:i w:val="0"/>
+                <w:color w:val="000000"/>
+                <w:sz w:val="24"/>
+              </w:rPr>
+              <w:t>Нотація</w:t>
+            </w:r>
+          </w:p>
+        </w:tc>
+        <w:tc>
+          <w:tcPr>
+            <w:tcW w:type="dxa" w:w="2339"/>
+          </w:tcPr>
+          <w:p>
+            <w:pPr>
+              <w:keepNext/>
+              <w:widowControl/>
+              <w:spacing w:line="240" w:lineRule="auto" w:before="0" w:after="0"/>
+              <w:ind w:firstLine="0" w:left="0"/>
+              <w:jc w:val="center"/>
+            </w:pPr>
+            <w:r/>
+            <w:r>
+              <w:rPr>
+                <w:rFonts w:ascii="Times New Roman" w:hAnsi="Times New Roman" w:cs="Times New Roman" w:eastAsia="Times New Roman"/>
+                <w:b/>
+                <w:i w:val="0"/>
+                <w:color w:val="000000"/>
+                <w:sz w:val="24"/>
+              </w:rPr>
+              <w:t>Засіб</w:t>
+            </w:r>
+          </w:p>
+        </w:tc>
+        <w:tc>
+          <w:tcPr>
+            <w:tcW w:type="dxa" w:w="2572"/>
+          </w:tcPr>
+          <w:p>
+            <w:pPr>
+              <w:keepNext/>
+              <w:widowControl/>
+              <w:spacing w:line="240" w:lineRule="auto" w:before="0" w:after="0"/>
+              <w:ind w:firstLine="0" w:left="0"/>
+              <w:jc w:val="center"/>
+            </w:pPr>
+            <w:r/>
+            <w:r>
+              <w:rPr>
+                <w:rFonts w:ascii="Times New Roman" w:hAnsi="Times New Roman" w:cs="Times New Roman" w:eastAsia="Times New Roman"/>
+                <w:b/>
+                <w:i w:val="0"/>
+                <w:color w:val="000000"/>
+                <w:sz w:val="24"/>
+              </w:rPr>
+              <w:t>Формат моделі</w:t>
+            </w:r>
+          </w:p>
+        </w:tc>
+        <w:tc>
+          <w:tcPr>
+            <w:tcW w:type="dxa" w:w="2923"/>
+          </w:tcPr>
+          <w:p>
+            <w:pPr>
+              <w:keepNext/>
+              <w:widowControl/>
+              <w:spacing w:line="240" w:lineRule="auto" w:before="0" w:after="0"/>
+              <w:ind w:firstLine="0" w:left="0"/>
+              <w:jc w:val="center"/>
+            </w:pPr>
+            <w:r/>
+            <w:r>
+              <w:rPr>
+                <w:rFonts w:ascii="Times New Roman" w:hAnsi="Times New Roman" w:cs="Times New Roman" w:eastAsia="Times New Roman"/>
+                <w:b/>
+                <w:i w:val="0"/>
+                <w:color w:val="000000"/>
+                <w:sz w:val="24"/>
+              </w:rPr>
+              <w:t>Можливості</w:t>
+            </w:r>
+          </w:p>
+        </w:tc>
+      </w:tr>
+      <w:tr>
+        <w:trPr>
+          <w:cantSplit w:val="true"/>
+        </w:trPr>
+        <w:tc>
+          <w:tcPr>
+            <w:tcW w:type="dxa" w:w="1520"/>
+          </w:tcPr>
+          <w:p>
+            <w:pPr>
+              <w:keepNext/>
+              <w:widowControl/>
+              <w:spacing w:line="240" w:lineRule="auto" w:before="0" w:after="0"/>
+              <w:ind w:firstLine="0" w:left="0"/>
+              <w:jc w:val="left"/>
+            </w:pPr>
+            <w:r/>
+            <w:r>
+              <w:rPr>
+                <w:rFonts w:ascii="Times New Roman" w:hAnsi="Times New Roman" w:cs="Times New Roman" w:eastAsia="Times New Roman"/>
+                <w:b w:val="0"/>
+                <w:i w:val="0"/>
+                <w:color w:val="000000"/>
+                <w:sz w:val="24"/>
+              </w:rPr>
+              <w:t>BPMN</w:t>
+            </w:r>
+          </w:p>
+        </w:tc>
+        <w:tc>
+          <w:tcPr>
+            <w:tcW w:type="dxa" w:w="2339"/>
+          </w:tcPr>
+          <w:p>
+            <w:pPr>
+              <w:keepNext/>
+              <w:widowControl/>
+              <w:spacing w:line="240" w:lineRule="auto" w:before="0" w:after="0"/>
+              <w:ind w:firstLine="0" w:left="0"/>
+              <w:jc w:val="left"/>
+            </w:pPr>
+            <w:r/>
+            <w:r>
+              <w:rPr>
+                <w:rFonts w:ascii="Times New Roman" w:hAnsi="Times New Roman" w:cs="Times New Roman" w:eastAsia="Times New Roman"/>
+                <w:b w:val="0"/>
+                <w:i w:val="0"/>
+                <w:color w:val="000000"/>
+                <w:sz w:val="24"/>
+              </w:rPr>
+              <w:t>bpmn-js — засіб перегляду та редагування моделей BPMN 2.0 [12]</w:t>
+            </w:r>
+          </w:p>
+        </w:tc>
+        <w:tc>
+          <w:tcPr>
+            <w:tcW w:type="dxa" w:w="2572"/>
+          </w:tcPr>
+          <w:p>
+            <w:pPr>
+              <w:keepNext/>
+              <w:widowControl/>
+              <w:spacing w:line="240" w:lineRule="auto" w:before="0" w:after="0"/>
+              <w:ind w:firstLine="0" w:left="0"/>
+              <w:jc w:val="left"/>
+            </w:pPr>
+            <w:r/>
+            <w:r>
+              <w:rPr>
+                <w:rFonts w:ascii="Times New Roman" w:hAnsi="Times New Roman" w:cs="Times New Roman" w:eastAsia="Times New Roman"/>
+                <w:b w:val="0"/>
+                <w:i w:val="0"/>
+                <w:color w:val="000000"/>
+                <w:sz w:val="24"/>
+              </w:rPr>
+              <w:t>XML-файл *.bpmn за специфікацією BPMN 2.0.2 [13] з розділом графічного подання (координати елементів)</w:t>
+            </w:r>
+          </w:p>
+        </w:tc>
+        <w:tc>
+          <w:tcPr>
+            <w:tcW w:type="dxa" w:w="2923"/>
+          </w:tcPr>
+          <w:p>
+            <w:pPr>
+              <w:keepNext/>
+              <w:widowControl/>
+              <w:spacing w:line="240" w:lineRule="auto" w:before="0" w:after="0"/>
+              <w:ind w:firstLine="0" w:left="0"/>
+              <w:jc w:val="left"/>
+            </w:pPr>
+            <w:r/>
+            <w:r>
+              <w:rPr>
+                <w:rFonts w:ascii="Times New Roman" w:hAnsi="Times New Roman" w:cs="Times New Roman" w:eastAsia="Times New Roman"/>
+                <w:b w:val="0"/>
+                <w:i w:val="0"/>
+                <w:color w:val="000000"/>
+                <w:sz w:val="24"/>
+              </w:rPr>
+              <w:t>Модель відкривається для перегляду та редагування в будь-якому засобі, сумісному з BPMN 2.0</w:t>
+            </w:r>
+          </w:p>
+        </w:tc>
+      </w:tr>
+      <w:tr>
+        <w:trPr>
+          <w:cantSplit w:val="true"/>
+        </w:trPr>
+        <w:tc>
+          <w:tcPr>
+            <w:tcW w:type="dxa" w:w="1520"/>
+          </w:tcPr>
+          <w:p>
+            <w:pPr>
+              <w:keepNext/>
+              <w:widowControl/>
+              <w:spacing w:line="240" w:lineRule="auto" w:before="0" w:after="0"/>
+              <w:ind w:firstLine="0" w:left="0"/>
+              <w:jc w:val="left"/>
+            </w:pPr>
+            <w:r/>
+            <w:r>
+              <w:rPr>
+                <w:rFonts w:ascii="Times New Roman" w:hAnsi="Times New Roman" w:cs="Times New Roman" w:eastAsia="Times New Roman"/>
+                <w:b w:val="0"/>
+                <w:i w:val="0"/>
+                <w:color w:val="000000"/>
+                <w:sz w:val="24"/>
+              </w:rPr>
+              <w:t>IDEF0</w:t>
+            </w:r>
+          </w:p>
+        </w:tc>
+        <w:tc>
+          <w:tcPr>
+            <w:tcW w:type="dxa" w:w="2339"/>
+          </w:tcPr>
+          <w:p>
+            <w:pPr>
+              <w:keepNext/>
+              <w:widowControl/>
+              <w:spacing w:line="240" w:lineRule="auto" w:before="0" w:after="0"/>
+              <w:ind w:firstLine="0" w:left="0"/>
+              <w:jc w:val="left"/>
+            </w:pPr>
+            <w:r/>
+            <w:r>
+              <w:rPr>
+                <w:rFonts w:ascii="Times New Roman" w:hAnsi="Times New Roman" w:cs="Times New Roman" w:eastAsia="Times New Roman"/>
+                <w:b w:val="0"/>
+                <w:i w:val="0"/>
+                <w:color w:val="000000"/>
+                <w:sz w:val="24"/>
+              </w:rPr>
+              <w:t>Генератор діаграм IDEF0 на мові Python в оформленні AllFusion Process Modeler</w:t>
+            </w:r>
+          </w:p>
+        </w:tc>
+        <w:tc>
+          <w:tcPr>
+            <w:tcW w:type="dxa" w:w="2572"/>
+          </w:tcPr>
+          <w:p>
+            <w:pPr>
+              <w:keepNext/>
+              <w:widowControl/>
+              <w:spacing w:line="240" w:lineRule="auto" w:before="0" w:after="0"/>
+              <w:ind w:firstLine="0" w:left="0"/>
+              <w:jc w:val="left"/>
+            </w:pPr>
+            <w:r/>
+            <w:r>
+              <w:rPr>
+                <w:rFonts w:ascii="Times New Roman" w:hAnsi="Times New Roman" w:cs="Times New Roman" w:eastAsia="Times New Roman"/>
+                <w:b w:val="0"/>
+                <w:i w:val="0"/>
+                <w:color w:val="000000"/>
+                <w:sz w:val="24"/>
+              </w:rPr>
+              <w:t>Перелік блоків і стрілок з кодами ICOM (вхід, управління, вихід, механізм)</w:t>
+            </w:r>
+          </w:p>
+        </w:tc>
+        <w:tc>
+          <w:tcPr>
+            <w:tcW w:type="dxa" w:w="2923"/>
+          </w:tcPr>
+          <w:p>
+            <w:pPr>
+              <w:keepNext/>
+              <w:widowControl/>
+              <w:spacing w:line="240" w:lineRule="auto" w:before="0" w:after="0"/>
+              <w:ind w:firstLine="0" w:left="0"/>
+              <w:jc w:val="left"/>
+            </w:pPr>
+            <w:r/>
+            <w:r>
+              <w:rPr>
+                <w:rFonts w:ascii="Times New Roman" w:hAnsi="Times New Roman" w:cs="Times New Roman" w:eastAsia="Times New Roman"/>
+                <w:b w:val="0"/>
+                <w:i w:val="0"/>
+                <w:color w:val="000000"/>
+                <w:sz w:val="24"/>
+              </w:rPr>
+              <w:t>Автоматична маршрутизація стрілок, розгалуження, рамка з полями вузла, назви й номера</w:t>
+            </w:r>
+          </w:p>
+        </w:tc>
+      </w:tr>
+      <w:tr>
+        <w:trPr>
+          <w:cantSplit w:val="true"/>
+        </w:trPr>
+        <w:tc>
+          <w:tcPr>
+            <w:tcW w:type="dxa" w:w="1520"/>
+          </w:tcPr>
+          <w:p>
+            <w:pPr>
+              <w:keepNext/>
+              <w:widowControl/>
+              <w:spacing w:line="240" w:lineRule="auto" w:before="0" w:after="0"/>
+              <w:ind w:firstLine="0" w:left="0"/>
+              <w:jc w:val="left"/>
+            </w:pPr>
+            <w:r/>
+            <w:r>
+              <w:rPr>
+                <w:rFonts w:ascii="Times New Roman" w:hAnsi="Times New Roman" w:cs="Times New Roman" w:eastAsia="Times New Roman"/>
+                <w:b w:val="0"/>
+                <w:i w:val="0"/>
+                <w:color w:val="000000"/>
+                <w:sz w:val="24"/>
+              </w:rPr>
+              <w:t>UML</w:t>
+            </w:r>
+          </w:p>
+        </w:tc>
+        <w:tc>
+          <w:tcPr>
+            <w:tcW w:type="dxa" w:w="2339"/>
+          </w:tcPr>
+          <w:p>
+            <w:pPr>
+              <w:keepNext/>
+              <w:widowControl/>
+              <w:spacing w:line="240" w:lineRule="auto" w:before="0" w:after="0"/>
+              <w:ind w:firstLine="0" w:left="0"/>
+              <w:jc w:val="left"/>
+            </w:pPr>
+            <w:r/>
+            <w:r>
+              <w:rPr>
+                <w:rFonts w:ascii="Times New Roman" w:hAnsi="Times New Roman" w:cs="Times New Roman" w:eastAsia="Times New Roman"/>
+                <w:b w:val="0"/>
+                <w:i w:val="0"/>
+                <w:color w:val="000000"/>
+                <w:sz w:val="24"/>
+              </w:rPr>
+              <w:t>PlantUML — засіб із відкритим кодом, що будує UML-діаграми з текстового опису [14]</w:t>
+            </w:r>
+          </w:p>
+        </w:tc>
+        <w:tc>
+          <w:tcPr>
+            <w:tcW w:type="dxa" w:w="2572"/>
+          </w:tcPr>
+          <w:p>
+            <w:pPr>
+              <w:keepNext/>
+              <w:widowControl/>
+              <w:spacing w:line="240" w:lineRule="auto" w:before="0" w:after="0"/>
+              <w:ind w:firstLine="0" w:left="0"/>
+              <w:jc w:val="left"/>
+            </w:pPr>
+            <w:r/>
+            <w:r>
+              <w:rPr>
+                <w:rFonts w:ascii="Times New Roman" w:hAnsi="Times New Roman" w:cs="Times New Roman" w:eastAsia="Times New Roman"/>
+                <w:b w:val="0"/>
+                <w:i w:val="0"/>
+                <w:color w:val="000000"/>
+                <w:sz w:val="24"/>
+              </w:rPr>
+              <w:t>Текстові файли *.puml</w:t>
+            </w:r>
+          </w:p>
+        </w:tc>
+        <w:tc>
+          <w:tcPr>
+            <w:tcW w:type="dxa" w:w="2923"/>
+          </w:tcPr>
+          <w:p>
+            <w:pPr>
+              <w:keepNext/>
+              <w:widowControl/>
+              <w:spacing w:line="240" w:lineRule="auto" w:before="0" w:after="0"/>
+              <w:ind w:firstLine="0" w:left="0"/>
+              <w:jc w:val="left"/>
+            </w:pPr>
+            <w:r/>
+            <w:r>
+              <w:rPr>
+                <w:rFonts w:ascii="Times New Roman" w:hAnsi="Times New Roman" w:cs="Times New Roman" w:eastAsia="Times New Roman"/>
+                <w:b w:val="0"/>
+                <w:i w:val="0"/>
+                <w:color w:val="000000"/>
+                <w:sz w:val="24"/>
+              </w:rPr>
+              <w:t>Діаграми станів, класів, діяльності, послідовності, кооперації, компонентів і розгортання; формати SVG і PNG</w:t>
+            </w:r>
+          </w:p>
+        </w:tc>
+      </w:tr>
+      <w:tr>
+        <w:trPr>
+          <w:cantSplit w:val="true"/>
+        </w:trPr>
+        <w:tc>
+          <w:tcPr>
+            <w:tcW w:type="dxa" w:w="1520"/>
+          </w:tcPr>
+          <w:p>
+            <w:pPr>
+              <w:keepNext w:val="0"/>
+              <w:widowControl/>
+              <w:spacing w:line="240" w:lineRule="auto" w:before="0" w:after="0"/>
+              <w:ind w:firstLine="0" w:left="0"/>
+              <w:jc w:val="left"/>
+            </w:pPr>
+            <w:r/>
+            <w:r>
+              <w:rPr>
+                <w:rFonts w:ascii="Times New Roman" w:hAnsi="Times New Roman" w:cs="Times New Roman" w:eastAsia="Times New Roman"/>
+                <w:b w:val="0"/>
+                <w:i w:val="0"/>
+                <w:color w:val="000000"/>
+                <w:sz w:val="24"/>
+              </w:rPr>
+              <w:t>Схема БД</w:t>
+            </w:r>
+          </w:p>
+        </w:tc>
+        <w:tc>
+          <w:tcPr>
+            <w:tcW w:type="dxa" w:w="2339"/>
+          </w:tcPr>
+          <w:p>
+            <w:pPr>
+              <w:keepNext w:val="0"/>
+              <w:widowControl/>
+              <w:spacing w:line="240" w:lineRule="auto" w:before="0" w:after="0"/>
+              <w:ind w:firstLine="0" w:left="0"/>
+              <w:jc w:val="left"/>
+            </w:pPr>
+            <w:r/>
+            <w:r>
+              <w:rPr>
+                <w:rFonts w:ascii="Times New Roman" w:hAnsi="Times New Roman" w:cs="Times New Roman" w:eastAsia="Times New Roman"/>
+                <w:b w:val="0"/>
+                <w:i w:val="0"/>
+                <w:color w:val="000000"/>
+                <w:sz w:val="24"/>
+              </w:rPr>
+              <w:t>Генератор SQL DDL (пряме проектування)</w:t>
+            </w:r>
+          </w:p>
+        </w:tc>
+        <w:tc>
+          <w:tcPr>
+            <w:tcW w:type="dxa" w:w="2572"/>
+          </w:tcPr>
+          <w:p>
+            <w:pPr>
+              <w:keepNext w:val="0"/>
+              <w:widowControl/>
+              <w:spacing w:line="240" w:lineRule="auto" w:before="0" w:after="0"/>
+              <w:ind w:firstLine="0" w:left="0"/>
+              <w:jc w:val="left"/>
+            </w:pPr>
+            <w:r/>
+            <w:r>
+              <w:rPr>
+                <w:rFonts w:ascii="Times New Roman" w:hAnsi="Times New Roman" w:cs="Times New Roman" w:eastAsia="Times New Roman"/>
+                <w:b w:val="0"/>
+                <w:i w:val="0"/>
+                <w:color w:val="000000"/>
+                <w:sz w:val="24"/>
+              </w:rPr>
+              <w:t>Діаграма класів фізичного рівня *.puml</w:t>
+            </w:r>
+          </w:p>
+        </w:tc>
+        <w:tc>
+          <w:tcPr>
+            <w:tcW w:type="dxa" w:w="2923"/>
+          </w:tcPr>
+          <w:p>
+            <w:pPr>
+              <w:keepNext w:val="0"/>
+              <w:widowControl/>
+              <w:spacing w:line="240" w:lineRule="auto" w:before="0" w:after="0"/>
+              <w:ind w:firstLine="0" w:left="0"/>
+              <w:jc w:val="left"/>
+            </w:pPr>
+            <w:r/>
+            <w:r>
+              <w:rPr>
+                <w:rFonts w:ascii="Times New Roman" w:hAnsi="Times New Roman" w:cs="Times New Roman" w:eastAsia="Times New Roman"/>
+                <w:b w:val="0"/>
+                <w:i w:val="0"/>
+                <w:color w:val="000000"/>
+                <w:sz w:val="24"/>
+              </w:rPr>
+              <w:t>Скрипт створення таблиць, ключів і переліків для СКБД PostgreSQL</w:t>
+            </w:r>
+          </w:p>
+        </w:tc>
+      </w:tr>
+    </w:tbl>
+    <w:p>
+      <w:pPr>
+        <w:keepNext w:val="0"/>
+        <w:widowControl/>
+        <w:spacing w:line="240" w:lineRule="auto" w:before="0" w:after="0"/>
+        <w:ind w:firstLine="0" w:left="0"/>
+        <w:jc w:val="both"/>
+      </w:pPr>
+    </w:p>
+    <w:p>
+      <w:pPr>
+        <w:keepNext w:val="0"/>
+        <w:widowControl/>
+        <w:spacing w:line="360" w:lineRule="auto" w:before="0" w:after="0"/>
+        <w:ind w:firstLine="709" w:left="0"/>
+        <w:jc w:val="both"/>
+      </w:pPr>
+      <w:r>
+        <w:rPr>
+          <w:rFonts w:ascii="Times New Roman" w:hAnsi="Times New Roman" w:cs="Times New Roman" w:eastAsia="Times New Roman"/>
+          <w:b w:val="0"/>
+          <w:i w:val="0"/>
+          <w:color w:val="000000"/>
+          <w:sz w:val="28"/>
+        </w:rPr>
+        <w:t>Послідовність обробки моделей показано на рис. 4.14. Вихідні моделі трьох нотацій зберігаються в репозиторії Git. Засоби bpmn-js, генератор IDEF0 та PlantUML формують з них векторні та растрові зображення, після чого кожне зображення проходить автоматичний контроль читабельності: розмір шрифту на сторінці звіту має бути не менше 10 пт, а роздільна здатність — не менше 300 dpi. Рисунки, що пройшли контроль, включаються до проектної документації. Діаграма класів фізичного рівня, крім того, передається генератору SQL DDL.</w:t>
+      </w:r>
+    </w:p>
+    <w:p>
+      <w:pPr>
+        <w:keepNext/>
+        <w:widowControl/>
+        <w:spacing w:line="240" w:lineRule="auto" w:before="120" w:after="0"/>
+        <w:ind w:firstLine="0" w:left="0"/>
+        <w:jc w:val="center"/>
+      </w:pPr>
+      <w:r>
+        <w:drawing>
+          <wp:inline xmlns:pic="http://schemas.openxmlformats.org/drawingml/2006/picture">
+            <wp:extent cx="5940000" cy="5475419"/>
+            <wp:docPr id="14" name="Picture 14"/>
+            <wp:cNvGraphicFramePr>
+              <a:graphicFrameLocks noChangeAspect="1"/>
+            </wp:cNvGraphicFramePr>
+            <a:graphic>
+              <a:graphicData uri="http://schemas.openxmlformats.org/drawingml/2006/picture">
+                <pic:pic>
+                  <pic:nvPicPr>
+                    <pic:cNvPr id="0" name="14_toolchain.png"/>
+                    <pic:cNvPicPr/>
+                  </pic:nvPicPr>
+                  <pic:blipFill>
+                    <a:blip r:embed="rId27"/>
+                    <a:stretch>
+                      <a:fillRect/>
+                    </a:stretch>
+                  </pic:blipFill>
+                  <pic:spPr>
+                    <a:xfrm>
+                      <a:off x="0" y="0"/>
+                      <a:ext cx="5940000" cy="5475419"/>
+                    </a:xfrm>
+                    <a:prstGeom prst="rect"/>
+                  </pic:spPr>
+                </pic:pic>
+              </a:graphicData>
+            </a:graphic>
+          </wp:inline>
+        </w:drawing>
+      </w:r>
+    </w:p>
+    <w:p>
+      <w:pPr>
+        <w:keepNext w:val="0"/>
+        <w:widowControl/>
+        <w:spacing w:line="360" w:lineRule="auto" w:before="120" w:after="120"/>
+        <w:ind w:firstLine="0" w:left="0"/>
+        <w:jc w:val="center"/>
+      </w:pPr>
+      <w:r>
+        <w:rPr>
+          <w:rFonts w:ascii="Times New Roman" w:hAnsi="Times New Roman" w:cs="Times New Roman" w:eastAsia="Times New Roman"/>
+          <w:b w:val="0"/>
+          <w:i w:val="0"/>
+          <w:color w:val="000000"/>
+          <w:sz w:val="28"/>
+        </w:rPr>
+        <w:t>Рис. 4.14 — Схема обробки моделей проектування</w:t>
+      </w:r>
+    </w:p>
+    <w:p>
+      <w:pPr>
+        <w:keepNext w:val="0"/>
+        <w:widowControl/>
+        <w:spacing w:line="360" w:lineRule="auto" w:before="0" w:after="0"/>
+        <w:ind w:firstLine="709" w:left="0"/>
+        <w:jc w:val="both"/>
+      </w:pPr>
+      <w:r>
+        <w:rPr>
+          <w:rFonts w:ascii="Times New Roman" w:hAnsi="Times New Roman" w:cs="Times New Roman" w:eastAsia="Times New Roman"/>
+          <w:b w:val="0"/>
+          <w:i w:val="0"/>
+          <w:color w:val="000000"/>
+          <w:sz w:val="28"/>
+        </w:rPr>
+        <w:t>Найважливішою властивістю CASE-засобу є можливість генерувати програмний код з побудованої моделі [2]. Для системи «Щит-Лінк» пряме проектування (forward engineering) виконано для схеми бази даних: генератор зчитує діаграму класів фізичного рівня (рис. 4.11) і діаграму станів (рис. 4.6) та формує скрипт мовою SQL для СКБД PostgreSQL за такими правилами:</w:t>
+      </w:r>
+    </w:p>
+    <w:p>
+      <w:pPr>
+        <w:keepNext w:val="0"/>
+        <w:widowControl/>
+        <w:spacing w:line="360" w:lineRule="auto" w:before="0" w:after="0"/>
+        <w:ind w:firstLine="709" w:left="0"/>
+        <w:jc w:val="both"/>
+      </w:pPr>
+      <w:r>
+        <w:rPr>
+          <w:rFonts w:ascii="Times New Roman" w:hAnsi="Times New Roman" w:cs="Times New Roman" w:eastAsia="Times New Roman"/>
+          <w:b w:val="0"/>
+          <w:i w:val="0"/>
+          <w:color w:val="000000"/>
+          <w:sz w:val="28"/>
+        </w:rPr>
+        <w:t>– клас зі стереотипом «table» перетворюється на оператор CREATE TABLE, атрибут з позначкою PK — на первинний ключ із генерацією значення UUID;</w:t>
+      </w:r>
+    </w:p>
+    <w:p>
+      <w:pPr>
+        <w:keepNext w:val="0"/>
+        <w:widowControl/>
+        <w:spacing w:line="360" w:lineRule="auto" w:before="0" w:after="0"/>
+        <w:ind w:firstLine="709" w:left="0"/>
+        <w:jc w:val="both"/>
+      </w:pPr>
+      <w:r>
+        <w:rPr>
+          <w:rFonts w:ascii="Times New Roman" w:hAnsi="Times New Roman" w:cs="Times New Roman" w:eastAsia="Times New Roman"/>
+          <w:b w:val="0"/>
+          <w:i w:val="0"/>
+          <w:color w:val="000000"/>
+          <w:sz w:val="28"/>
+        </w:rPr>
+        <w:t>– атрибут з позначкою FK перетворюється на зовнішній ключ (REFERENCES); таблиця, на яку він посилається, визначається за збігом імені стовпця з первинним ключем або, якщо імена відрізняються (approved_by), за асоціацією діаграми;</w:t>
+      </w:r>
+    </w:p>
+    <w:p>
+      <w:pPr>
+        <w:keepNext w:val="0"/>
+        <w:widowControl/>
+        <w:spacing w:line="360" w:lineRule="auto" w:before="0" w:after="0"/>
+        <w:ind w:firstLine="709" w:left="0"/>
+        <w:jc w:val="both"/>
+      </w:pPr>
+      <w:r>
+        <w:rPr>
+          <w:rFonts w:ascii="Times New Roman" w:hAnsi="Times New Roman" w:cs="Times New Roman" w:eastAsia="Times New Roman"/>
+          <w:b w:val="0"/>
+          <w:i w:val="0"/>
+          <w:color w:val="000000"/>
+          <w:sz w:val="28"/>
+        </w:rPr>
+        <w:t>– кратність 0..1 на боці таблиці, на яку посилається ключ, дозволяє порожнє значення, а кратність 0..1 на боці таблиці з ключем додає обмеження унікальності (UNIQUE), що реалізує відношення 1 : 0..1;</w:t>
+      </w:r>
+    </w:p>
+    <w:p>
+      <w:pPr>
+        <w:keepNext w:val="0"/>
+        <w:widowControl/>
+        <w:spacing w:line="360" w:lineRule="auto" w:before="0" w:after="0"/>
+        <w:ind w:firstLine="709" w:left="0"/>
+        <w:jc w:val="both"/>
+      </w:pPr>
+      <w:r>
+        <w:rPr>
+          <w:rFonts w:ascii="Times New Roman" w:hAnsi="Times New Roman" w:cs="Times New Roman" w:eastAsia="Times New Roman"/>
+          <w:b w:val="0"/>
+          <w:i w:val="0"/>
+          <w:color w:val="000000"/>
+          <w:sz w:val="28"/>
+        </w:rPr>
+        <w:t>– тип ENUM перетворюється на оператор CREATE TYPE; значення типу mission_state беруться безпосередньо зі станів діаграми станів сутності «Місія»;</w:t>
+      </w:r>
+    </w:p>
+    <w:p>
+      <w:pPr>
+        <w:keepNext w:val="0"/>
+        <w:widowControl/>
+        <w:spacing w:line="360" w:lineRule="auto" w:before="0" w:after="0"/>
+        <w:ind w:firstLine="709" w:left="0"/>
+        <w:jc w:val="both"/>
+      </w:pPr>
+      <w:r>
+        <w:rPr>
+          <w:rFonts w:ascii="Times New Roman" w:hAnsi="Times New Roman" w:cs="Times New Roman" w:eastAsia="Times New Roman"/>
+          <w:b w:val="0"/>
+          <w:i w:val="0"/>
+          <w:color w:val="000000"/>
+          <w:sz w:val="28"/>
+        </w:rPr>
+        <w:t>– таблиці впорядковуються так, щоб таблиця, на яку посилається зовнішній ключ, створювалася раніше.</w:t>
+      </w:r>
+    </w:p>
+    <w:p>
+      <w:pPr>
+        <w:keepNext w:val="0"/>
+        <w:widowControl/>
+        <w:spacing w:line="360" w:lineRule="auto" w:before="0" w:after="0"/>
+        <w:ind w:firstLine="709" w:left="0"/>
+        <w:jc w:val="both"/>
+      </w:pPr>
+      <w:r>
+        <w:rPr>
+          <w:rFonts w:ascii="Times New Roman" w:hAnsi="Times New Roman" w:cs="Times New Roman" w:eastAsia="Times New Roman"/>
+          <w:b w:val="0"/>
+          <w:i w:val="0"/>
+          <w:color w:val="000000"/>
+          <w:sz w:val="28"/>
+        </w:rPr>
+        <w:t>Фрагмент згенерованого скрипту наведено на рис. 4.15; повний скрипт містить п’ять типів-переліків і шість таблиць. Скрипт перевірено виконанням у СКБД PostgreSQL 18: усі оператори виконано без помилок, а структура таблиці mission відповідає діаграмі — чотири зовнішні ключі, з яких interceptor_id і approved_by допускають порожнє значення до пуску та санкції відповідно.</w:t>
+      </w:r>
+    </w:p>
+    <w:p>
+      <w:pPr>
+        <w:keepNext/>
+        <w:widowControl/>
+        <w:spacing w:line="240" w:lineRule="auto" w:before="120" w:after="0"/>
+        <w:ind w:firstLine="0" w:left="0"/>
+        <w:jc w:val="center"/>
+      </w:pPr>
+      <w:r>
+        <w:drawing>
+          <wp:inline xmlns:pic="http://schemas.openxmlformats.org/drawingml/2006/picture">
+            <wp:extent cx="5220000" cy="6354879"/>
+            <wp:docPr id="15" name="Picture 15"/>
+            <wp:cNvGraphicFramePr>
+              <a:graphicFrameLocks noChangeAspect="1"/>
+            </wp:cNvGraphicFramePr>
+            <a:graphic>
+              <a:graphicData uri="http://schemas.openxmlformats.org/drawingml/2006/picture">
+                <pic:pic>
+                  <pic:nvPicPr>
+                    <pic:cNvPr id="0" name="15_ddl_fragment.png"/>
+                    <pic:cNvPicPr/>
+                  </pic:nvPicPr>
+                  <pic:blipFill>
+                    <a:blip r:embed="rId28"/>
+                    <a:stretch>
+                      <a:fillRect/>
+                    </a:stretch>
+                  </pic:blipFill>
+                  <pic:spPr>
+                    <a:xfrm>
+                      <a:off x="0" y="0"/>
+                      <a:ext cx="5220000" cy="6354879"/>
+                    </a:xfrm>
+                    <a:prstGeom prst="rect"/>
+                  </pic:spPr>
+                </pic:pic>
+              </a:graphicData>
+            </a:graphic>
+          </wp:inline>
+        </w:drawing>
+      </w:r>
+    </w:p>
+    <w:p>
+      <w:pPr>
+        <w:keepNext w:val="0"/>
+        <w:widowControl/>
+        <w:spacing w:line="360" w:lineRule="auto" w:before="120" w:after="120"/>
+        <w:ind w:firstLine="0" w:left="0"/>
+        <w:jc w:val="center"/>
+      </w:pPr>
+      <w:r>
+        <w:rPr>
+          <w:rFonts w:ascii="Times New Roman" w:hAnsi="Times New Roman" w:cs="Times New Roman" w:eastAsia="Times New Roman"/>
+          <w:b w:val="0"/>
+          <w:i w:val="0"/>
+          <w:color w:val="000000"/>
+          <w:sz w:val="28"/>
+        </w:rPr>
+        <w:t>Рис. 4.15 — Фрагмент SQL-скрипту, згенерованого з діаграми класів фізичного рівня</w:t>
+      </w:r>
+    </w:p>
+    <w:p>
+      <w:pPr>
+        <w:keepNext w:val="0"/>
+        <w:widowControl/>
+        <w:spacing w:line="360" w:lineRule="auto" w:before="0" w:after="0"/>
+        <w:ind w:firstLine="709" w:left="0"/>
+        <w:jc w:val="both"/>
+      </w:pPr>
+      <w:r>
+        <w:rPr>
+          <w:rFonts w:ascii="Times New Roman" w:hAnsi="Times New Roman" w:cs="Times New Roman" w:eastAsia="Times New Roman"/>
+          <w:b w:val="0"/>
+          <w:i w:val="0"/>
+          <w:color w:val="000000"/>
+          <w:sz w:val="28"/>
+        </w:rPr>
+        <w:t>Повторна генерація після зміни діаграми оновлює скрипт автоматично, тому фізична модель і схема бази даних не розходяться. Зв’язок між діаграмою станів і типом mission_state забезпечує, що новий стан місії, доданий до моделі поведінки, одразу стає допустимим значенням у базі даних. Таким чином, результати моделювання перетворюються не лише на проектну документацію, а й на програмний артефакт, придатний для використання на етапі реалізації.</w:t>
       </w:r>
     </w:p>
     <w:p>
@@ -5291,7 +7475,7 @@
         <w:ind w:firstLine="0" w:left="0"/>
         <w:jc w:val="center"/>
       </w:pPr>
-      <w:bookmarkStart w:id="8" w:name="_Toc000008"/>
+      <w:bookmarkStart w:id="9" w:name="_Toc000009"/>
       <w:r>
         <w:rPr>
           <w:rFonts w:ascii="Times New Roman" w:hAnsi="Times New Roman" w:cs="Times New Roman" w:eastAsia="Times New Roman"/>
@@ -5302,7 +7486,7 @@
         </w:rPr>
         <w:t>ВИСНОВКИ</w:t>
       </w:r>
-      <w:bookmarkEnd w:id="8"/>
+      <w:bookmarkEnd w:id="9"/>
     </w:p>
     <w:p>
       <w:pPr>
@@ -5396,7 +7580,26 @@
           <w:color w:val="000000"/>
           <w:sz w:val="28"/>
         </w:rPr>
-        <w:t>4) Моделі узгоджені між собою та з результатами попередніх практичних робіт: вимогами ПР1, архітектурою ПР2 і обладнанням ПР3.</w:t>
+        <w:t>4) Моделі реалізовано в CASE-засобах за підходом «модель як код» (bpmn-js, PlantUML, генератор IDEF0) під керуванням версій Git; з діаграми класів фізичного рівня автоматично згенеровано SQL-скрипт схеми бази даних для PostgreSQL, працездатність якого перевірено виконанням у СКБД.</w:t>
+      </w:r>
+    </w:p>
+    <w:p>
+      <w:pPr>
+        <w:keepNext w:val="0"/>
+        <w:widowControl/>
+        <w:spacing w:line="360" w:lineRule="auto" w:before="0" w:after="0"/>
+        <w:ind w:firstLine="709" w:left="0"/>
+        <w:jc w:val="both"/>
+      </w:pPr>
+      <w:r>
+        <w:rPr>
+          <w:rFonts w:ascii="Times New Roman" w:hAnsi="Times New Roman" w:cs="Times New Roman" w:eastAsia="Times New Roman"/>
+          <w:b w:val="0"/>
+          <w:i w:val="0"/>
+          <w:color w:val="000000"/>
+          <w:sz w:val="28"/>
+        </w:rPr>
+        <w:t>5) Моделі узгоджені між собою та з результатами попередніх практичних робіт: вимогами ПР1, архітектурою ПР2 і обладнанням ПР3.</w:t>
       </w:r>
     </w:p>
     <w:p>
@@ -5428,7 +7631,7 @@
         <w:ind w:firstLine="0" w:left="0"/>
         <w:jc w:val="center"/>
       </w:pPr>
-      <w:bookmarkStart w:id="9" w:name="_Toc000009"/>
+      <w:bookmarkStart w:id="10" w:name="_Toc000010"/>
       <w:r>
         <w:rPr>
           <w:rFonts w:ascii="Times New Roman" w:hAnsi="Times New Roman" w:cs="Times New Roman" w:eastAsia="Times New Roman"/>
@@ -5439,7 +7642,7 @@
         </w:rPr>
         <w:t>СПИСОК ВИКОРИСТАНИХ ДЖЕРЕЛ</w:t>
       </w:r>
-      <w:bookmarkEnd w:id="9"/>
+      <w:bookmarkEnd w:id="10"/>
     </w:p>
     <w:p>
       <w:pPr>
@@ -5629,6 +7832,82 @@
           <w:sz w:val="28"/>
         </w:rPr>
         <w:t>10. Карпенко М. Ю., Манакова Н. О., Гавриленко І. О. Технології створення програмних продуктів та інформаційних систем : навч. посібник. Харків : ХНУМГ ім. О. М. Бекетова, 2017. 93 с.</w:t>
+      </w:r>
+    </w:p>
+    <w:p>
+      <w:pPr>
+        <w:keepNext w:val="0"/>
+        <w:widowControl/>
+        <w:spacing w:line="360" w:lineRule="auto" w:before="0" w:after="0"/>
+        <w:ind w:firstLine="709" w:left="0"/>
+        <w:jc w:val="left"/>
+      </w:pPr>
+      <w:r>
+        <w:rPr>
+          <w:rFonts w:ascii="Times New Roman" w:hAnsi="Times New Roman" w:cs="Times New Roman" w:eastAsia="Times New Roman"/>
+          <w:b w:val="0"/>
+          <w:i w:val="0"/>
+          <w:color w:val="000000"/>
+          <w:sz w:val="28"/>
+        </w:rPr>
+        <w:t>11. Засоби та інструменти розробки ПЗ : лекція 7 з дисципліни «Технології створення програмних продуктів» / викл. О. В. Кравченко. Київ : КНУ імені Тараса Шевченка, 2026. 17 слайдів.</w:t>
+      </w:r>
+    </w:p>
+    <w:p>
+      <w:pPr>
+        <w:keepNext w:val="0"/>
+        <w:widowControl/>
+        <w:spacing w:line="360" w:lineRule="auto" w:before="0" w:after="0"/>
+        <w:ind w:firstLine="709" w:left="0"/>
+        <w:jc w:val="left"/>
+      </w:pPr>
+      <w:r>
+        <w:rPr>
+          <w:rFonts w:ascii="Times New Roman" w:hAnsi="Times New Roman" w:cs="Times New Roman" w:eastAsia="Times New Roman"/>
+          <w:b w:val="0"/>
+          <w:i w:val="0"/>
+          <w:color w:val="000000"/>
+          <w:sz w:val="28"/>
+        </w:rPr>
+        <w:t>12. bpmn-js: BPMN 2.0 viewer and editor / bpmn.io. URL: https://bpmn.io/toolkit/bpmn-js/ (дата звернення: 11.10.2026).</w:t>
+      </w:r>
+    </w:p>
+    <w:p>
+      <w:pPr>
+        <w:keepNext w:val="0"/>
+        <w:widowControl/>
+        <w:spacing w:line="360" w:lineRule="auto" w:before="0" w:after="0"/>
+        <w:ind w:firstLine="709" w:left="0"/>
+        <w:jc w:val="left"/>
+      </w:pPr>
+      <w:r>
+        <w:rPr>
+          <w:rFonts w:ascii="Times New Roman" w:hAnsi="Times New Roman" w:cs="Times New Roman" w:eastAsia="Times New Roman"/>
+          <w:b w:val="0"/>
+          <w:i w:val="0"/>
+          <w:color w:val="000000"/>
+          <w:sz w:val="28"/>
+        </w:rPr>
+        <w:t>13. Business Process Model and Notation (BPMN). Version 2.0.2 / Object Management Group. 2014. URL: https://www.omg.org/spec/BPMN/2.0.2/ (дата звернення: 11.10.2026).</w:t>
+      </w:r>
+    </w:p>
+    <w:p>
+      <w:pPr>
+        <w:keepNext w:val="0"/>
+        <w:widowControl/>
+        <w:spacing w:line="360" w:lineRule="auto" w:before="0" w:after="0"/>
+        <w:ind w:firstLine="709" w:left="0"/>
+        <w:jc w:val="left"/>
+      </w:pPr>
+      <w:r>
+        <w:rPr>
+          <w:rFonts w:ascii="Times New Roman" w:hAnsi="Times New Roman" w:cs="Times New Roman" w:eastAsia="Times New Roman"/>
+          <w:b w:val="0"/>
+          <w:i w:val="0"/>
+          <w:color w:val="000000"/>
+          <w:sz w:val="28"/>
+        </w:rPr>
+        <w:t>14. PlantUML: open-source tool for UML diagrams. URL: https://plantuml.com/ (дата звернення: 11.10.2026).</w:t>
       </w:r>
     </w:p>
     <w:sectPr>

</xml_diff>